<commit_message>
phan cong cac scrum moi
</commit_message>
<xml_diff>
--- a/prompts/ke_hoach_sprint2.docx
+++ b/prompts/ke_hoach_sprint2.docx
@@ -23,13 +23,7 @@
         <w:spacing w:after="160"/>
       </w:pPr>
       <w:r>
-        <w:rPr>
-          <w:rFonts w:ascii="Arial" w:cs="Arial" w:eastAsia="Arial" w:hAnsi="Arial"/>
-          <w:color w:val="444444"/>
-          <w:sz w:val="22"/>
-          <w:szCs w:val="22"/>
-        </w:rPr>
-        <w:t xml:space="preserve">Nhóm TTCS_K8S4_N5  |  Sprint: 30/9 – 7/10/2026  |  27 work items (SCRUM-107 đến SCRUM-135)</w:t>
+        <w:t>Nhóm TTCS_K8S4_N5  |  Sprint: 30/9 – 7/10/2026  |  27 work items + 11 story tổng hợp</w:t>
       </w:r>
     </w:p>
     <w:p>
@@ -1365,7 +1359,7 @@
                 <w:sz w:val="17"/>
                 <w:szCs w:val="17"/>
               </w:rPr>
-              <w:t xml:space="preserve">SCRUM-107, 117, 119, 125, 127</w:t>
+              <w:t>SCRUM-133, 117, 119, 125, 127</w:t>
             </w:r>
           </w:p>
         </w:tc>
@@ -2138,7 +2132,7 @@
                 <w:sz w:val="17"/>
                 <w:szCs w:val="17"/>
               </w:rPr>
-              <w:t xml:space="preserve">NLT (112, 117, 119, 132), Tân (129), NQT (107), Vinh (111)</w:t>
+              <w:t>NLT (112, 117, 119, 132), Tân (129), NQT (133), Vinh (111)</w:t>
             </w:r>
           </w:p>
         </w:tc>
@@ -2502,7 +2496,7 @@
                 <w:sz w:val="17"/>
                 <w:szCs w:val="17"/>
               </w:rPr>
-              <w:t xml:space="preserve">NQT (127, 109, 107), Vinh (32), NLT (mọi handler)</w:t>
+              <w:t>NQT (127, 109, 133), Vinh (32), NLT (mọi handler)</w:t>
             </w:r>
           </w:p>
         </w:tc>
@@ -3594,7 +3588,7 @@
                 <w:sz w:val="17"/>
                 <w:szCs w:val="17"/>
               </w:rPr>
-              <w:t xml:space="preserve">NQT (107), Vinh (128)</w:t>
+              <w:t>NQT (133), Vinh (128)</w:t>
             </w:r>
           </w:p>
         </w:tc>
@@ -4177,7 +4171,7 @@
                 <w:sz w:val="17"/>
                 <w:szCs w:val="17"/>
               </w:rPr>
-              <w:t xml:space="preserve">107</w:t>
+              <w:t>133</w:t>
             </w:r>
           </w:p>
         </w:tc>
@@ -6477,7 +6471,7 @@
                 <w:sz w:val="17"/>
                 <w:szCs w:val="17"/>
               </w:rPr>
-              <w:t xml:space="preserve">Tú chờ NQT (107, API 134), Tuấn (lưới 124), Đại (auth)</w:t>
+              <w:t>Tú chờ NQT (133, API 134), Tuấn (lưới 124), Đại (auth)</w:t>
             </w:r>
           </w:p>
         </w:tc>
@@ -7204,7 +7198,7 @@
           <w:sz w:val="20"/>
           <w:szCs w:val="20"/>
         </w:rPr>
-        <w:t xml:space="preserve">SCRUM-107.</w:t>
+        <w:t>SCRUM-133.</w:t>
       </w:r>
     </w:p>
     <w:p>
@@ -7944,7 +7938,7 @@
           <w:sz w:val="20"/>
           <w:szCs w:val="20"/>
         </w:rPr>
-        <w:t xml:space="preserve">NQT (107 và API 134), Tuấn (lưới 124), Đại (auth).</w:t>
+        <w:t>NQT (133 và API 134), Tuấn (lưới 124), Đại (auth).</w:t>
       </w:r>
     </w:p>
     <w:p>
@@ -8258,7 +8252,7 @@
           <w:sz w:val="20"/>
           <w:szCs w:val="20"/>
         </w:rPr>
-        <w:t xml:space="preserve">chạy kịch bản trụ ảo để nghiệm thu 112, 113, 119, 120, 121, 107, 109.</w:t>
+        <w:t>chạy kịch bản trụ ảo để nghiệm thu 112, 113, 119, 120, 121, 133, 109.</w:t>
       </w:r>
     </w:p>
     <w:p>
@@ -8467,7 +8461,7 @@
           <w:sz w:val="20"/>
           <w:szCs w:val="20"/>
         </w:rPr>
-        <w:t xml:space="preserve">110 → 108 → 127 → 107 → 134 (API) → 134 (giao diện) → test UI</w:t>
+        <w:t>110 → 108 → 127 → 133 → 134 (API) → 134 (giao diện) → test UI</w:t>
       </w:r>
     </w:p>
     <w:p>
@@ -8681,9 +8675,3935 @@
         <w:t xml:space="preserve"> (135, 134, 130) chỉ đóng khi cả hai phần xong.</w:t>
       </w:r>
     </w:p>
+    <w:p>
+      <w:pPr>
+        <w:sectPr>
+          <w:pgSz w:w="16838" w:h="11906" w:orient="landscape"/>
+          <w:pgMar w:top="720" w:right="720" w:bottom="720" w:left="720" w:header="708" w:footer="708" w:gutter="0"/>
+          <w:pgNumType/>
+          <w:docGrid w:linePitch="360"/>
+        </w:sectPr>
+      </w:pPr>
+    </w:p>
+    <w:p>
+      <w:pPr>
+        <w:spacing w:before="0" w:after="160"/>
+      </w:pPr>
+      <w:r>
+        <w:rPr>
+          <w:b/>
+          <w:sz w:val="28"/>
+        </w:rPr>
+        <w:t>6. Scrum bổ sung từ ảnh</w:t>
+      </w:r>
+    </w:p>
+    <w:p>
+      <w:pPr>
+        <w:spacing w:after="120"/>
+      </w:pPr>
+      <w:r>
+        <w:t>Các Scrum-42–52 được trình bày dưới đây theo cùng cấu trúc bảng phân công chính, với owner, thời gian, đầu vào và đầu ra. Đây là các dòng tổng hợp story từ task con đã giao, không cộng thêm vào 27 work item. Mã công việc này trong bảng kế hoạch đã được đổi thành SCRUM-133; owner vẫn là NQT.</w:t>
+      </w:r>
+    </w:p>
+    <w:p>
+      <w:pPr>
+        <w:spacing w:before="120" w:after="80"/>
+      </w:pPr>
+      <w:r>
+        <w:rPr>
+          <w:b/>
+          <w:sz w:val="22"/>
+        </w:rPr>
+        <w:t>6.1 Bảng phân công Scrum bổ sung</w:t>
+      </w:r>
+    </w:p>
+    <w:tbl>
+      <w:tblPr>
+        <w:tblW w:type="auto" w:w="0"/>
+        <w:jc w:val="center"/>
+        <w:tblLayout w:type="fixed"/>
+        <w:tblLook w:firstColumn="1" w:firstRow="1" w:lastColumn="0" w:lastRow="0" w:noHBand="0" w:noVBand="1" w:val="04A0"/>
+        <w:tblBorders>
+          <w:top w:val="single" w:sz="4" w:color="A6A6A6"/>
+          <w:left w:val="single" w:sz="4" w:color="A6A6A6"/>
+          <w:bottom w:val="single" w:sz="4" w:color="A6A6A6"/>
+          <w:right w:val="single" w:sz="4" w:color="A6A6A6"/>
+          <w:insideH w:val="single" w:sz="4" w:color="A6A6A6"/>
+          <w:insideV w:val="single" w:sz="4" w:color="A6A6A6"/>
+        </w:tblBorders>
+      </w:tblPr>
+      <w:tblGrid>
+        <w:gridCol w:w="1720"/>
+        <w:gridCol w:w="1720"/>
+        <w:gridCol w:w="1720"/>
+        <w:gridCol w:w="1720"/>
+        <w:gridCol w:w="1720"/>
+        <w:gridCol w:w="1720"/>
+      </w:tblGrid>
+      <w:tr>
+        <w:trPr>
+          <w:tblHeader w:val="true"/>
+        </w:trPr>
+        <w:tc>
+          <w:tcPr>
+            <w:tcW w:type="dxa" w:w="936"/>
+            <w:shd w:fill="D9EAF7"/>
+            <w:tcMar>
+              <w:top w:w="45" w:type="dxa"/>
+              <w:start w:w="55" w:type="dxa"/>
+              <w:bottom w:w="45" w:type="dxa"/>
+              <w:end w:w="55" w:type="dxa"/>
+            </w:tcMar>
+          </w:tcPr>
+          <w:p>
+            <w:r>
+              <w:rPr>
+                <w:b/>
+                <w:sz w:val="16"/>
+              </w:rPr>
+              <w:t>SCRUM</w:t>
+            </w:r>
+          </w:p>
+        </w:tc>
+        <w:tc>
+          <w:tcPr>
+            <w:tcW w:type="dxa" w:w="3888"/>
+            <w:shd w:fill="D9EAF7"/>
+            <w:tcMar>
+              <w:top w:w="45" w:type="dxa"/>
+              <w:start w:w="55" w:type="dxa"/>
+              <w:bottom w:w="45" w:type="dxa"/>
+              <w:end w:w="55" w:type="dxa"/>
+            </w:tcMar>
+          </w:tcPr>
+          <w:p>
+            <w:r>
+              <w:rPr>
+                <w:b/>
+                <w:sz w:val="16"/>
+              </w:rPr>
+              <w:t>Việc</w:t>
+            </w:r>
+          </w:p>
+        </w:tc>
+        <w:tc>
+          <w:tcPr>
+            <w:tcW w:type="dxa" w:w="2376"/>
+            <w:shd w:fill="D9EAF7"/>
+            <w:tcMar>
+              <w:top w:w="45" w:type="dxa"/>
+              <w:start w:w="55" w:type="dxa"/>
+              <w:bottom w:w="45" w:type="dxa"/>
+              <w:end w:w="55" w:type="dxa"/>
+            </w:tcMar>
+          </w:tcPr>
+          <w:p>
+            <w:r>
+              <w:rPr>
+                <w:b/>
+                <w:sz w:val="16"/>
+              </w:rPr>
+              <w:t>Owner</w:t>
+            </w:r>
+          </w:p>
+        </w:tc>
+        <w:tc>
+          <w:tcPr>
+            <w:tcW w:type="dxa" w:w="2088"/>
+            <w:shd w:fill="D9EAF7"/>
+            <w:tcMar>
+              <w:top w:w="45" w:type="dxa"/>
+              <w:start w:w="55" w:type="dxa"/>
+              <w:bottom w:w="45" w:type="dxa"/>
+              <w:end w:w="55" w:type="dxa"/>
+            </w:tcMar>
+          </w:tcPr>
+          <w:p>
+            <w:r>
+              <w:rPr>
+                <w:b/>
+                <w:sz w:val="16"/>
+              </w:rPr>
+              <w:t>Thời gian</w:t>
+            </w:r>
+          </w:p>
+        </w:tc>
+        <w:tc>
+          <w:tcPr>
+            <w:tcW w:type="dxa" w:w="2592"/>
+            <w:shd w:fill="D9EAF7"/>
+            <w:tcMar>
+              <w:top w:w="45" w:type="dxa"/>
+              <w:start w:w="55" w:type="dxa"/>
+              <w:bottom w:w="45" w:type="dxa"/>
+              <w:end w:w="55" w:type="dxa"/>
+            </w:tcMar>
+          </w:tcPr>
+          <w:p>
+            <w:r>
+              <w:rPr>
+                <w:b/>
+                <w:sz w:val="16"/>
+              </w:rPr>
+              <w:t>CHỜ AI (đầu vào)</w:t>
+            </w:r>
+          </w:p>
+        </w:tc>
+        <w:tc>
+          <w:tcPr>
+            <w:tcW w:type="dxa" w:w="2592"/>
+            <w:shd w:fill="D9EAF7"/>
+            <w:tcMar>
+              <w:top w:w="45" w:type="dxa"/>
+              <w:start w:w="55" w:type="dxa"/>
+              <w:bottom w:w="45" w:type="dxa"/>
+              <w:end w:w="55" w:type="dxa"/>
+            </w:tcMar>
+          </w:tcPr>
+          <w:p>
+            <w:r>
+              <w:rPr>
+                <w:b/>
+                <w:sz w:val="16"/>
+              </w:rPr>
+              <w:t>AI CHỜ MÌNH (đầu ra)</w:t>
+            </w:r>
+          </w:p>
+        </w:tc>
+      </w:tr>
+      <w:tr>
+        <w:tc>
+          <w:tcPr>
+            <w:tcW w:type="dxa" w:w="936"/>
+            <w:vAlign w:val="center"/>
+            <w:tcMar>
+              <w:top w:w="45" w:type="dxa"/>
+              <w:start w:w="55" w:type="dxa"/>
+              <w:bottom w:w="45" w:type="dxa"/>
+              <w:end w:w="55" w:type="dxa"/>
+            </w:tcMar>
+          </w:tcPr>
+          <w:p>
+            <w:pPr>
+              <w:spacing w:after="0" w:before="0"/>
+            </w:pPr>
+            <w:r>
+              <w:rPr>
+                <w:sz w:val="16"/>
+              </w:rPr>
+              <w:t>42</w:t>
+            </w:r>
+          </w:p>
+        </w:tc>
+        <w:tc>
+          <w:tcPr>
+            <w:tcW w:type="dxa" w:w="3888"/>
+            <w:vAlign w:val="center"/>
+            <w:tcMar>
+              <w:top w:w="45" w:type="dxa"/>
+              <w:start w:w="55" w:type="dxa"/>
+              <w:bottom w:w="45" w:type="dxa"/>
+              <w:end w:w="55" w:type="dxa"/>
+            </w:tcMar>
+          </w:tcPr>
+          <w:p>
+            <w:pPr>
+              <w:spacing w:after="0" w:before="0"/>
+            </w:pPr>
+            <w:r>
+              <w:rPr>
+                <w:sz w:val="16"/>
+              </w:rPr>
+              <w:t>Story: Trụ đã đăng ký kết nối qua WebSocket; trụ lạ bị từ chối. Task con: 108, 109.</w:t>
+            </w:r>
+          </w:p>
+        </w:tc>
+        <w:tc>
+          <w:tcPr>
+            <w:tcW w:type="dxa" w:w="2376"/>
+            <w:vAlign w:val="center"/>
+            <w:tcMar>
+              <w:top w:w="45" w:type="dxa"/>
+              <w:start w:w="55" w:type="dxa"/>
+              <w:bottom w:w="45" w:type="dxa"/>
+              <w:end w:w="55" w:type="dxa"/>
+            </w:tcMar>
+          </w:tcPr>
+          <w:p>
+            <w:pPr>
+              <w:spacing w:after="0" w:before="0"/>
+            </w:pPr>
+            <w:r>
+              <w:rPr>
+                <w:sz w:val="16"/>
+              </w:rPr>
+              <w:t>NQT</w:t>
+            </w:r>
+          </w:p>
+        </w:tc>
+        <w:tc>
+          <w:tcPr>
+            <w:tcW w:type="dxa" w:w="2088"/>
+            <w:vAlign w:val="center"/>
+            <w:tcMar>
+              <w:top w:w="45" w:type="dxa"/>
+              <w:start w:w="55" w:type="dxa"/>
+              <w:bottom w:w="45" w:type="dxa"/>
+              <w:end w:w="55" w:type="dxa"/>
+            </w:tcMar>
+          </w:tcPr>
+          <w:p>
+            <w:pPr>
+              <w:spacing w:after="0" w:before="0"/>
+            </w:pPr>
+            <w:r>
+              <w:rPr>
+                <w:sz w:val="16"/>
+              </w:rPr>
+              <w:t>30/9 PM – 1/10 PM</w:t>
+            </w:r>
+          </w:p>
+        </w:tc>
+        <w:tc>
+          <w:tcPr>
+            <w:tcW w:type="dxa" w:w="2592"/>
+            <w:vAlign w:val="center"/>
+            <w:tcMar>
+              <w:top w:w="45" w:type="dxa"/>
+              <w:start w:w="55" w:type="dxa"/>
+              <w:bottom w:w="45" w:type="dxa"/>
+              <w:end w:w="55" w:type="dxa"/>
+            </w:tcMar>
+          </w:tcPr>
+          <w:p>
+            <w:pPr>
+              <w:spacing w:after="0" w:before="0"/>
+            </w:pPr>
+            <w:r>
+              <w:rPr>
+                <w:sz w:val="16"/>
+              </w:rPr>
+              <w:t>Bảng charge_points có sẵn; endpoint 108 sẵn sàng</w:t>
+            </w:r>
+          </w:p>
+        </w:tc>
+        <w:tc>
+          <w:tcPr>
+            <w:tcW w:type="dxa" w:w="2592"/>
+            <w:vAlign w:val="center"/>
+            <w:tcMar>
+              <w:top w:w="45" w:type="dxa"/>
+              <w:start w:w="55" w:type="dxa"/>
+              <w:bottom w:w="45" w:type="dxa"/>
+              <w:end w:w="55" w:type="dxa"/>
+            </w:tcMar>
+          </w:tcPr>
+          <w:p>
+            <w:pPr>
+              <w:spacing w:after="0" w:before="0"/>
+            </w:pPr>
+            <w:r>
+              <w:rPr>
+                <w:sz w:val="16"/>
+              </w:rPr>
+              <w:t>Vinh (32); NLT (handler); Đức (nghiệm thu)</w:t>
+            </w:r>
+          </w:p>
+        </w:tc>
+      </w:tr>
+      <w:tr>
+        <w:tc>
+          <w:tcPr>
+            <w:tcW w:type="dxa" w:w="936"/>
+            <w:vAlign w:val="center"/>
+            <w:tcMar>
+              <w:top w:w="45" w:type="dxa"/>
+              <w:start w:w="55" w:type="dxa"/>
+              <w:bottom w:w="45" w:type="dxa"/>
+              <w:end w:w="55" w:type="dxa"/>
+            </w:tcMar>
+          </w:tcPr>
+          <w:p>
+            <w:pPr>
+              <w:spacing w:after="0" w:before="0"/>
+            </w:pPr>
+            <w:r>
+              <w:rPr>
+                <w:sz w:val="16"/>
+              </w:rPr>
+              <w:t>43</w:t>
+            </w:r>
+          </w:p>
+        </w:tc>
+        <w:tc>
+          <w:tcPr>
+            <w:tcW w:type="dxa" w:w="3888"/>
+            <w:vAlign w:val="center"/>
+            <w:tcMar>
+              <w:top w:w="45" w:type="dxa"/>
+              <w:start w:w="55" w:type="dxa"/>
+              <w:bottom w:w="45" w:type="dxa"/>
+              <w:end w:w="55" w:type="dxa"/>
+            </w:tcMar>
+          </w:tcPr>
+          <w:p>
+            <w:pPr>
+              <w:spacing w:after="0" w:before="0"/>
+            </w:pPr>
+            <w:r>
+              <w:rPr>
+                <w:sz w:val="16"/>
+              </w:rPr>
+              <w:t>Story: Đọc/ghi ba loại khung OCPP đúng. Task con: 110, 111.</w:t>
+            </w:r>
+          </w:p>
+        </w:tc>
+        <w:tc>
+          <w:tcPr>
+            <w:tcW w:type="dxa" w:w="2376"/>
+            <w:vAlign w:val="center"/>
+            <w:tcMar>
+              <w:top w:w="45" w:type="dxa"/>
+              <w:start w:w="55" w:type="dxa"/>
+              <w:bottom w:w="45" w:type="dxa"/>
+              <w:end w:w="55" w:type="dxa"/>
+            </w:tcMar>
+          </w:tcPr>
+          <w:p>
+            <w:pPr>
+              <w:spacing w:after="0" w:before="0"/>
+            </w:pPr>
+            <w:r>
+              <w:rPr>
+                <w:sz w:val="16"/>
+              </w:rPr>
+              <w:t>NQT; Vinh (test)</w:t>
+            </w:r>
+          </w:p>
+        </w:tc>
+        <w:tc>
+          <w:tcPr>
+            <w:tcW w:type="dxa" w:w="2088"/>
+            <w:vAlign w:val="center"/>
+            <w:tcMar>
+              <w:top w:w="45" w:type="dxa"/>
+              <w:start w:w="55" w:type="dxa"/>
+              <w:bottom w:w="45" w:type="dxa"/>
+              <w:end w:w="55" w:type="dxa"/>
+            </w:tcMar>
+          </w:tcPr>
+          <w:p>
+            <w:pPr>
+              <w:spacing w:after="0" w:before="0"/>
+            </w:pPr>
+            <w:r>
+              <w:rPr>
+                <w:sz w:val="16"/>
+              </w:rPr>
+              <w:t>30/9 AM – PM</w:t>
+            </w:r>
+          </w:p>
+        </w:tc>
+        <w:tc>
+          <w:tcPr>
+            <w:tcW w:type="dxa" w:w="2592"/>
+            <w:vAlign w:val="center"/>
+            <w:tcMar>
+              <w:top w:w="45" w:type="dxa"/>
+              <w:start w:w="55" w:type="dxa"/>
+              <w:bottom w:w="45" w:type="dxa"/>
+              <w:end w:w="55" w:type="dxa"/>
+            </w:tcMar>
+          </w:tcPr>
+          <w:p>
+            <w:pPr>
+              <w:spacing w:after="0" w:before="0"/>
+            </w:pPr>
+            <w:r>
+              <w:rPr>
+                <w:sz w:val="16"/>
+              </w:rPr>
+              <w:t>Chốt định dạng frame tại Planning</w:t>
+            </w:r>
+          </w:p>
+        </w:tc>
+        <w:tc>
+          <w:tcPr>
+            <w:tcW w:type="dxa" w:w="2592"/>
+            <w:vAlign w:val="center"/>
+            <w:tcMar>
+              <w:top w:w="45" w:type="dxa"/>
+              <w:start w:w="55" w:type="dxa"/>
+              <w:bottom w:w="45" w:type="dxa"/>
+              <w:end w:w="55" w:type="dxa"/>
+            </w:tcMar>
+          </w:tcPr>
+          <w:p>
+            <w:pPr>
+              <w:spacing w:after="0" w:before="0"/>
+            </w:pPr>
+            <w:r>
+              <w:rPr>
+                <w:sz w:val="16"/>
+              </w:rPr>
+              <w:t>NLT (112,117,119,132); Tân (129); Vinh (111)</w:t>
+            </w:r>
+          </w:p>
+        </w:tc>
+      </w:tr>
+      <w:tr>
+        <w:tc>
+          <w:tcPr>
+            <w:tcW w:type="dxa" w:w="936"/>
+            <w:vAlign w:val="center"/>
+            <w:tcMar>
+              <w:top w:w="45" w:type="dxa"/>
+              <w:start w:w="55" w:type="dxa"/>
+              <w:bottom w:w="45" w:type="dxa"/>
+              <w:end w:w="55" w:type="dxa"/>
+            </w:tcMar>
+          </w:tcPr>
+          <w:p>
+            <w:pPr>
+              <w:spacing w:after="0" w:before="0"/>
+            </w:pPr>
+            <w:r>
+              <w:rPr>
+                <w:sz w:val="16"/>
+              </w:rPr>
+              <w:t>44</w:t>
+            </w:r>
+          </w:p>
+        </w:tc>
+        <w:tc>
+          <w:tcPr>
+            <w:tcW w:type="dxa" w:w="3888"/>
+            <w:vAlign w:val="center"/>
+            <w:tcMar>
+              <w:top w:w="45" w:type="dxa"/>
+              <w:start w:w="55" w:type="dxa"/>
+              <w:bottom w:w="45" w:type="dxa"/>
+              <w:end w:w="55" w:type="dxa"/>
+            </w:tcMar>
+          </w:tcPr>
+          <w:p>
+            <w:pPr>
+              <w:spacing w:after="0" w:before="0"/>
+            </w:pPr>
+            <w:r>
+              <w:rPr>
+                <w:sz w:val="16"/>
+              </w:rPr>
+              <w:t>Story: BootNotification được chấp nhận. Task con: 112, 113.</w:t>
+            </w:r>
+          </w:p>
+        </w:tc>
+        <w:tc>
+          <w:tcPr>
+            <w:tcW w:type="dxa" w:w="2376"/>
+            <w:vAlign w:val="center"/>
+            <w:tcMar>
+              <w:top w:w="45" w:type="dxa"/>
+              <w:start w:w="55" w:type="dxa"/>
+              <w:bottom w:w="45" w:type="dxa"/>
+              <w:end w:w="55" w:type="dxa"/>
+            </w:tcMar>
+          </w:tcPr>
+          <w:p>
+            <w:pPr>
+              <w:spacing w:after="0" w:before="0"/>
+            </w:pPr>
+            <w:r>
+              <w:rPr>
+                <w:sz w:val="16"/>
+              </w:rPr>
+              <w:t>NLT</w:t>
+            </w:r>
+          </w:p>
+        </w:tc>
+        <w:tc>
+          <w:tcPr>
+            <w:tcW w:type="dxa" w:w="2088"/>
+            <w:vAlign w:val="center"/>
+            <w:tcMar>
+              <w:top w:w="45" w:type="dxa"/>
+              <w:start w:w="55" w:type="dxa"/>
+              <w:bottom w:w="45" w:type="dxa"/>
+              <w:end w:w="55" w:type="dxa"/>
+            </w:tcMar>
+          </w:tcPr>
+          <w:p>
+            <w:pPr>
+              <w:spacing w:after="0" w:before="0"/>
+            </w:pPr>
+            <w:r>
+              <w:rPr>
+                <w:sz w:val="16"/>
+              </w:rPr>
+              <w:t>30/9 PM – 1/10 AM; 5/10 PM</w:t>
+            </w:r>
+          </w:p>
+        </w:tc>
+        <w:tc>
+          <w:tcPr>
+            <w:tcW w:type="dxa" w:w="2592"/>
+            <w:vAlign w:val="center"/>
+            <w:tcMar>
+              <w:top w:w="45" w:type="dxa"/>
+              <w:start w:w="55" w:type="dxa"/>
+              <w:bottom w:w="45" w:type="dxa"/>
+              <w:end w:w="55" w:type="dxa"/>
+            </w:tcMar>
+          </w:tcPr>
+          <w:p>
+            <w:pPr>
+              <w:spacing w:after="0" w:before="0"/>
+            </w:pPr>
+            <w:r>
+              <w:rPr>
+                <w:sz w:val="16"/>
+              </w:rPr>
+              <w:t>NQT (110); skeleton WebSocket (108)</w:t>
+            </w:r>
+          </w:p>
+        </w:tc>
+        <w:tc>
+          <w:tcPr>
+            <w:tcW w:type="dxa" w:w="2592"/>
+            <w:vAlign w:val="center"/>
+            <w:tcMar>
+              <w:top w:w="45" w:type="dxa"/>
+              <w:start w:w="55" w:type="dxa"/>
+              <w:bottom w:w="45" w:type="dxa"/>
+              <w:end w:w="55" w:type="dxa"/>
+            </w:tcMar>
+          </w:tcPr>
+          <w:p>
+            <w:pPr>
+              <w:spacing w:after="0" w:before="0"/>
+            </w:pPr>
+            <w:r>
+              <w:rPr>
+                <w:sz w:val="16"/>
+              </w:rPr>
+              <w:t>Đức; NLT (113)</w:t>
+            </w:r>
+          </w:p>
+        </w:tc>
+      </w:tr>
+      <w:tr>
+        <w:tc>
+          <w:tcPr>
+            <w:tcW w:type="dxa" w:w="936"/>
+            <w:vAlign w:val="center"/>
+            <w:tcMar>
+              <w:top w:w="45" w:type="dxa"/>
+              <w:start w:w="55" w:type="dxa"/>
+              <w:bottom w:w="45" w:type="dxa"/>
+              <w:end w:w="55" w:type="dxa"/>
+            </w:tcMar>
+          </w:tcPr>
+          <w:p>
+            <w:pPr>
+              <w:spacing w:after="0" w:before="0"/>
+            </w:pPr>
+            <w:r>
+              <w:rPr>
+                <w:sz w:val="16"/>
+              </w:rPr>
+              <w:t>45</w:t>
+            </w:r>
+          </w:p>
+        </w:tc>
+        <w:tc>
+          <w:tcPr>
+            <w:tcW w:type="dxa" w:w="3888"/>
+            <w:vAlign w:val="center"/>
+            <w:tcMar>
+              <w:top w:w="45" w:type="dxa"/>
+              <w:start w:w="55" w:type="dxa"/>
+              <w:bottom w:w="45" w:type="dxa"/>
+              <w:end w:w="55" w:type="dxa"/>
+            </w:tcMar>
+          </w:tcPr>
+          <w:p>
+            <w:pPr>
+              <w:spacing w:after="0" w:before="0"/>
+            </w:pPr>
+            <w:r>
+              <w:rPr>
+                <w:sz w:val="16"/>
+              </w:rPr>
+              <w:t>Story: Heartbeat cập nhật thời điểm liên lạc cuối. Task con: 117, 118.</w:t>
+            </w:r>
+          </w:p>
+        </w:tc>
+        <w:tc>
+          <w:tcPr>
+            <w:tcW w:type="dxa" w:w="2376"/>
+            <w:vAlign w:val="center"/>
+            <w:tcMar>
+              <w:top w:w="45" w:type="dxa"/>
+              <w:start w:w="55" w:type="dxa"/>
+              <w:bottom w:w="45" w:type="dxa"/>
+              <w:end w:w="55" w:type="dxa"/>
+            </w:tcMar>
+          </w:tcPr>
+          <w:p>
+            <w:pPr>
+              <w:spacing w:after="0" w:before="0"/>
+            </w:pPr>
+            <w:r>
+              <w:rPr>
+                <w:sz w:val="16"/>
+              </w:rPr>
+              <w:t>NLT; Vinh (test)</w:t>
+            </w:r>
+          </w:p>
+        </w:tc>
+        <w:tc>
+          <w:tcPr>
+            <w:tcW w:type="dxa" w:w="2088"/>
+            <w:vAlign w:val="center"/>
+            <w:tcMar>
+              <w:top w:w="45" w:type="dxa"/>
+              <w:start w:w="55" w:type="dxa"/>
+              <w:bottom w:w="45" w:type="dxa"/>
+              <w:end w:w="55" w:type="dxa"/>
+            </w:tcMar>
+          </w:tcPr>
+          <w:p>
+            <w:pPr>
+              <w:spacing w:after="0" w:before="0"/>
+            </w:pPr>
+            <w:r>
+              <w:rPr>
+                <w:sz w:val="16"/>
+              </w:rPr>
+              <w:t>1/10 PM – 2/10 AM</w:t>
+            </w:r>
+          </w:p>
+        </w:tc>
+        <w:tc>
+          <w:tcPr>
+            <w:tcW w:type="dxa" w:w="2592"/>
+            <w:vAlign w:val="center"/>
+            <w:tcMar>
+              <w:top w:w="45" w:type="dxa"/>
+              <w:start w:w="55" w:type="dxa"/>
+              <w:bottom w:w="45" w:type="dxa"/>
+              <w:end w:w="55" w:type="dxa"/>
+            </w:tcMar>
+          </w:tcPr>
+          <w:p>
+            <w:pPr>
+              <w:spacing w:after="0" w:before="0"/>
+            </w:pPr>
+            <w:r>
+              <w:rPr>
+                <w:sz w:val="16"/>
+              </w:rPr>
+              <w:t>NQT (110); bộ trụ ảo (32)</w:t>
+            </w:r>
+          </w:p>
+        </w:tc>
+        <w:tc>
+          <w:tcPr>
+            <w:tcW w:type="dxa" w:w="2592"/>
+            <w:vAlign w:val="center"/>
+            <w:tcMar>
+              <w:top w:w="45" w:type="dxa"/>
+              <w:start w:w="55" w:type="dxa"/>
+              <w:bottom w:w="45" w:type="dxa"/>
+              <w:end w:w="55" w:type="dxa"/>
+            </w:tcMar>
+          </w:tcPr>
+          <w:p>
+            <w:pPr>
+              <w:spacing w:after="0" w:before="0"/>
+            </w:pPr>
+            <w:r>
+              <w:rPr>
+                <w:sz w:val="16"/>
+              </w:rPr>
+              <w:t>Tân (125); Vinh (118)</w:t>
+            </w:r>
+          </w:p>
+        </w:tc>
+      </w:tr>
+      <w:tr>
+        <w:tc>
+          <w:tcPr>
+            <w:tcW w:type="dxa" w:w="936"/>
+            <w:vAlign w:val="center"/>
+            <w:tcMar>
+              <w:top w:w="45" w:type="dxa"/>
+              <w:start w:w="55" w:type="dxa"/>
+              <w:bottom w:w="45" w:type="dxa"/>
+              <w:end w:w="55" w:type="dxa"/>
+            </w:tcMar>
+          </w:tcPr>
+          <w:p>
+            <w:pPr>
+              <w:spacing w:after="0" w:before="0"/>
+            </w:pPr>
+            <w:r>
+              <w:rPr>
+                <w:sz w:val="16"/>
+              </w:rPr>
+              <w:t>46</w:t>
+            </w:r>
+          </w:p>
+        </w:tc>
+        <w:tc>
+          <w:tcPr>
+            <w:tcW w:type="dxa" w:w="3888"/>
+            <w:vAlign w:val="center"/>
+            <w:tcMar>
+              <w:top w:w="45" w:type="dxa"/>
+              <w:start w:w="55" w:type="dxa"/>
+              <w:bottom w:w="45" w:type="dxa"/>
+              <w:end w:w="55" w:type="dxa"/>
+            </w:tcMar>
+          </w:tcPr>
+          <w:p>
+            <w:pPr>
+              <w:spacing w:after="0" w:before="0"/>
+            </w:pPr>
+            <w:r>
+              <w:rPr>
+                <w:sz w:val="16"/>
+              </w:rPr>
+              <w:t>Story: Cập nhật trạng thái từng đầu nối. Task con: 119, 120, 121.</w:t>
+            </w:r>
+          </w:p>
+        </w:tc>
+        <w:tc>
+          <w:tcPr>
+            <w:tcW w:type="dxa" w:w="2376"/>
+            <w:vAlign w:val="center"/>
+            <w:tcMar>
+              <w:top w:w="45" w:type="dxa"/>
+              <w:start w:w="55" w:type="dxa"/>
+              <w:bottom w:w="45" w:type="dxa"/>
+              <w:end w:w="55" w:type="dxa"/>
+            </w:tcMar>
+          </w:tcPr>
+          <w:p>
+            <w:pPr>
+              <w:spacing w:after="0" w:before="0"/>
+            </w:pPr>
+            <w:r>
+              <w:rPr>
+                <w:sz w:val="16"/>
+              </w:rPr>
+              <w:t>NLT</w:t>
+            </w:r>
+          </w:p>
+        </w:tc>
+        <w:tc>
+          <w:tcPr>
+            <w:tcW w:type="dxa" w:w="2088"/>
+            <w:vAlign w:val="center"/>
+            <w:tcMar>
+              <w:top w:w="45" w:type="dxa"/>
+              <w:start w:w="55" w:type="dxa"/>
+              <w:bottom w:w="45" w:type="dxa"/>
+              <w:end w:w="55" w:type="dxa"/>
+            </w:tcMar>
+          </w:tcPr>
+          <w:p>
+            <w:pPr>
+              <w:spacing w:after="0" w:before="0"/>
+            </w:pPr>
+            <w:r>
+              <w:rPr>
+                <w:sz w:val="16"/>
+              </w:rPr>
+              <w:t>2/10 – 5/10 AM</w:t>
+            </w:r>
+          </w:p>
+        </w:tc>
+        <w:tc>
+          <w:tcPr>
+            <w:tcW w:type="dxa" w:w="2592"/>
+            <w:vAlign w:val="center"/>
+            <w:tcMar>
+              <w:top w:w="45" w:type="dxa"/>
+              <w:start w:w="55" w:type="dxa"/>
+              <w:bottom w:w="45" w:type="dxa"/>
+              <w:end w:w="55" w:type="dxa"/>
+            </w:tcMar>
+          </w:tcPr>
+          <w:p>
+            <w:pPr>
+              <w:spacing w:after="0" w:before="0"/>
+            </w:pPr>
+            <w:r>
+              <w:rPr>
+                <w:sz w:val="16"/>
+              </w:rPr>
+              <w:t>NQT (110); chốt bảng ánh xạ trạng thái ở Planning</w:t>
+            </w:r>
+          </w:p>
+        </w:tc>
+        <w:tc>
+          <w:tcPr>
+            <w:tcW w:type="dxa" w:w="2592"/>
+            <w:vAlign w:val="center"/>
+            <w:tcMar>
+              <w:top w:w="45" w:type="dxa"/>
+              <w:start w:w="55" w:type="dxa"/>
+              <w:bottom w:w="45" w:type="dxa"/>
+              <w:end w:w="55" w:type="dxa"/>
+            </w:tcMar>
+          </w:tcPr>
+          <w:p>
+            <w:pPr>
+              <w:spacing w:after="0" w:before="0"/>
+            </w:pPr>
+            <w:r>
+              <w:rPr>
+                <w:sz w:val="16"/>
+              </w:rPr>
+              <w:t>NQT (123); Tân (122); Đức (nghiệm thu)</w:t>
+            </w:r>
+          </w:p>
+        </w:tc>
+      </w:tr>
+      <w:tr>
+        <w:tc>
+          <w:tcPr>
+            <w:tcW w:type="dxa" w:w="936"/>
+            <w:vAlign w:val="center"/>
+            <w:tcMar>
+              <w:top w:w="45" w:type="dxa"/>
+              <w:start w:w="55" w:type="dxa"/>
+              <w:bottom w:w="45" w:type="dxa"/>
+              <w:end w:w="55" w:type="dxa"/>
+            </w:tcMar>
+          </w:tcPr>
+          <w:p>
+            <w:pPr>
+              <w:spacing w:after="0" w:before="0"/>
+            </w:pPr>
+            <w:r>
+              <w:rPr>
+                <w:sz w:val="16"/>
+              </w:rPr>
+              <w:t>47</w:t>
+            </w:r>
+          </w:p>
+        </w:tc>
+        <w:tc>
+          <w:tcPr>
+            <w:tcW w:type="dxa" w:w="3888"/>
+            <w:vAlign w:val="center"/>
+            <w:tcMar>
+              <w:top w:w="45" w:type="dxa"/>
+              <w:start w:w="55" w:type="dxa"/>
+              <w:bottom w:w="45" w:type="dxa"/>
+              <w:end w:w="55" w:type="dxa"/>
+            </w:tcMar>
+          </w:tcPr>
+          <w:p>
+            <w:pPr>
+              <w:spacing w:after="0" w:before="0"/>
+            </w:pPr>
+            <w:r>
+              <w:rPr>
+                <w:sz w:val="16"/>
+              </w:rPr>
+              <w:t>Story: Màn hình trạng thái trụ tự cập nhật. Task con: 122, 123, 124.</w:t>
+            </w:r>
+          </w:p>
+        </w:tc>
+        <w:tc>
+          <w:tcPr>
+            <w:tcW w:type="dxa" w:w="2376"/>
+            <w:vAlign w:val="center"/>
+            <w:tcMar>
+              <w:top w:w="45" w:type="dxa"/>
+              <w:start w:w="55" w:type="dxa"/>
+              <w:bottom w:w="45" w:type="dxa"/>
+              <w:end w:w="55" w:type="dxa"/>
+            </w:tcMar>
+          </w:tcPr>
+          <w:p>
+            <w:pPr>
+              <w:spacing w:after="0" w:before="0"/>
+            </w:pPr>
+            <w:r>
+              <w:rPr>
+                <w:sz w:val="16"/>
+              </w:rPr>
+              <w:t>Tân (truy vấn), NQT (realtime), Tuấn (UI); Tú (hook)</w:t>
+            </w:r>
+          </w:p>
+        </w:tc>
+        <w:tc>
+          <w:tcPr>
+            <w:tcW w:type="dxa" w:w="2088"/>
+            <w:vAlign w:val="center"/>
+            <w:tcMar>
+              <w:top w:w="45" w:type="dxa"/>
+              <w:start w:w="55" w:type="dxa"/>
+              <w:bottom w:w="45" w:type="dxa"/>
+              <w:end w:w="55" w:type="dxa"/>
+            </w:tcMar>
+          </w:tcPr>
+          <w:p>
+            <w:pPr>
+              <w:spacing w:after="0" w:before="0"/>
+            </w:pPr>
+            <w:r>
+              <w:rPr>
+                <w:sz w:val="16"/>
+              </w:rPr>
+              <w:t>5/10 AM – 6/10 AM ghép dữ liệu thật</w:t>
+            </w:r>
+          </w:p>
+        </w:tc>
+        <w:tc>
+          <w:tcPr>
+            <w:tcW w:type="dxa" w:w="2592"/>
+            <w:vAlign w:val="center"/>
+            <w:tcMar>
+              <w:top w:w="45" w:type="dxa"/>
+              <w:start w:w="55" w:type="dxa"/>
+              <w:bottom w:w="45" w:type="dxa"/>
+              <w:end w:w="55" w:type="dxa"/>
+            </w:tcMar>
+          </w:tcPr>
+          <w:p>
+            <w:pPr>
+              <w:spacing w:after="0" w:before="0"/>
+            </w:pPr>
+            <w:r>
+              <w:rPr>
+                <w:sz w:val="16"/>
+              </w:rPr>
+              <w:t>NLT (119); Đại (auth guard); Tuấn/Tú (định dạng sự kiện)</w:t>
+            </w:r>
+          </w:p>
+        </w:tc>
+        <w:tc>
+          <w:tcPr>
+            <w:tcW w:type="dxa" w:w="2592"/>
+            <w:vAlign w:val="center"/>
+            <w:tcMar>
+              <w:top w:w="45" w:type="dxa"/>
+              <w:start w:w="55" w:type="dxa"/>
+              <w:bottom w:w="45" w:type="dxa"/>
+              <w:end w:w="55" w:type="dxa"/>
+            </w:tcMar>
+          </w:tcPr>
+          <w:p>
+            <w:pPr>
+              <w:spacing w:after="0" w:before="0"/>
+            </w:pPr>
+            <w:r>
+              <w:rPr>
+                <w:sz w:val="16"/>
+              </w:rPr>
+              <w:t>Đức (nghiệm thu UI)</w:t>
+            </w:r>
+          </w:p>
+        </w:tc>
+      </w:tr>
+      <w:tr>
+        <w:tc>
+          <w:tcPr>
+            <w:tcW w:type="dxa" w:w="936"/>
+            <w:vAlign w:val="center"/>
+            <w:tcMar>
+              <w:top w:w="45" w:type="dxa"/>
+              <w:start w:w="55" w:type="dxa"/>
+              <w:bottom w:w="45" w:type="dxa"/>
+              <w:end w:w="55" w:type="dxa"/>
+            </w:tcMar>
+          </w:tcPr>
+          <w:p>
+            <w:pPr>
+              <w:spacing w:after="0" w:before="0"/>
+            </w:pPr>
+            <w:r>
+              <w:rPr>
+                <w:sz w:val="16"/>
+              </w:rPr>
+              <w:t>48</w:t>
+            </w:r>
+          </w:p>
+        </w:tc>
+        <w:tc>
+          <w:tcPr>
+            <w:tcW w:type="dxa" w:w="3888"/>
+            <w:vAlign w:val="center"/>
+            <w:tcMar>
+              <w:top w:w="45" w:type="dxa"/>
+              <w:start w:w="55" w:type="dxa"/>
+              <w:bottom w:w="45" w:type="dxa"/>
+              <w:end w:w="55" w:type="dxa"/>
+            </w:tcMar>
+          </w:tcPr>
+          <w:p>
+            <w:pPr>
+              <w:spacing w:after="0" w:before="0"/>
+            </w:pPr>
+            <w:r>
+              <w:rPr>
+                <w:sz w:val="16"/>
+              </w:rPr>
+              <w:t>Story: Trụ quá hạn nhịp tim chuyển ngoại tuyến. Task con: 125, 126.</w:t>
+            </w:r>
+          </w:p>
+        </w:tc>
+        <w:tc>
+          <w:tcPr>
+            <w:tcW w:type="dxa" w:w="2376"/>
+            <w:vAlign w:val="center"/>
+            <w:tcMar>
+              <w:top w:w="45" w:type="dxa"/>
+              <w:start w:w="55" w:type="dxa"/>
+              <w:bottom w:w="45" w:type="dxa"/>
+              <w:end w:w="55" w:type="dxa"/>
+            </w:tcMar>
+          </w:tcPr>
+          <w:p>
+            <w:pPr>
+              <w:spacing w:after="0" w:before="0"/>
+            </w:pPr>
+            <w:r>
+              <w:rPr>
+                <w:sz w:val="16"/>
+              </w:rPr>
+              <w:t>Tân; Đức (test)</w:t>
+            </w:r>
+          </w:p>
+        </w:tc>
+        <w:tc>
+          <w:tcPr>
+            <w:tcW w:type="dxa" w:w="2088"/>
+            <w:vAlign w:val="center"/>
+            <w:tcMar>
+              <w:top w:w="45" w:type="dxa"/>
+              <w:start w:w="55" w:type="dxa"/>
+              <w:bottom w:w="45" w:type="dxa"/>
+              <w:end w:w="55" w:type="dxa"/>
+            </w:tcMar>
+          </w:tcPr>
+          <w:p>
+            <w:pPr>
+              <w:spacing w:after="0" w:before="0"/>
+            </w:pPr>
+            <w:r>
+              <w:rPr>
+                <w:sz w:val="16"/>
+              </w:rPr>
+              <w:t>2/10 – 5/10 AM</w:t>
+            </w:r>
+          </w:p>
+        </w:tc>
+        <w:tc>
+          <w:tcPr>
+            <w:tcW w:type="dxa" w:w="2592"/>
+            <w:vAlign w:val="center"/>
+            <w:tcMar>
+              <w:top w:w="45" w:type="dxa"/>
+              <w:start w:w="55" w:type="dxa"/>
+              <w:bottom w:w="45" w:type="dxa"/>
+              <w:end w:w="55" w:type="dxa"/>
+            </w:tcMar>
+          </w:tcPr>
+          <w:p>
+            <w:pPr>
+              <w:spacing w:after="0" w:before="0"/>
+            </w:pPr>
+            <w:r>
+              <w:rPr>
+                <w:sz w:val="16"/>
+              </w:rPr>
+              <w:t>NLT (117); bộ trụ ảo (32)</w:t>
+            </w:r>
+          </w:p>
+        </w:tc>
+        <w:tc>
+          <w:tcPr>
+            <w:tcW w:type="dxa" w:w="2592"/>
+            <w:vAlign w:val="center"/>
+            <w:tcMar>
+              <w:top w:w="45" w:type="dxa"/>
+              <w:start w:w="55" w:type="dxa"/>
+              <w:bottom w:w="45" w:type="dxa"/>
+              <w:end w:w="55" w:type="dxa"/>
+            </w:tcMar>
+          </w:tcPr>
+          <w:p>
+            <w:pPr>
+              <w:spacing w:after="0" w:before="0"/>
+            </w:pPr>
+            <w:r>
+              <w:rPr>
+                <w:sz w:val="16"/>
+              </w:rPr>
+              <w:t>Đức (126, cổng QA)</w:t>
+            </w:r>
+          </w:p>
+        </w:tc>
+      </w:tr>
+      <w:tr>
+        <w:tc>
+          <w:tcPr>
+            <w:tcW w:type="dxa" w:w="936"/>
+            <w:vAlign w:val="center"/>
+            <w:tcMar>
+              <w:top w:w="45" w:type="dxa"/>
+              <w:start w:w="55" w:type="dxa"/>
+              <w:bottom w:w="45" w:type="dxa"/>
+              <w:end w:w="55" w:type="dxa"/>
+            </w:tcMar>
+          </w:tcPr>
+          <w:p>
+            <w:pPr>
+              <w:spacing w:after="0" w:before="0"/>
+            </w:pPr>
+            <w:r>
+              <w:rPr>
+                <w:sz w:val="16"/>
+              </w:rPr>
+              <w:t>49</w:t>
+            </w:r>
+          </w:p>
+        </w:tc>
+        <w:tc>
+          <w:tcPr>
+            <w:tcW w:type="dxa" w:w="3888"/>
+            <w:vAlign w:val="center"/>
+            <w:tcMar>
+              <w:top w:w="45" w:type="dxa"/>
+              <w:start w:w="55" w:type="dxa"/>
+              <w:bottom w:w="45" w:type="dxa"/>
+              <w:end w:w="55" w:type="dxa"/>
+            </w:tcMar>
+          </w:tcPr>
+          <w:p>
+            <w:pPr>
+              <w:spacing w:after="0" w:before="0"/>
+            </w:pPr>
+            <w:r>
+              <w:rPr>
+                <w:sz w:val="16"/>
+              </w:rPr>
+              <w:t>Story: Kết nối cũ bị đóng khi trùng mã trụ. Task con: 127, 128.</w:t>
+            </w:r>
+          </w:p>
+        </w:tc>
+        <w:tc>
+          <w:tcPr>
+            <w:tcW w:type="dxa" w:w="2376"/>
+            <w:vAlign w:val="center"/>
+            <w:tcMar>
+              <w:top w:w="45" w:type="dxa"/>
+              <w:start w:w="55" w:type="dxa"/>
+              <w:bottom w:w="45" w:type="dxa"/>
+              <w:end w:w="55" w:type="dxa"/>
+            </w:tcMar>
+          </w:tcPr>
+          <w:p>
+            <w:pPr>
+              <w:spacing w:after="0" w:before="0"/>
+            </w:pPr>
+            <w:r>
+              <w:rPr>
+                <w:sz w:val="16"/>
+              </w:rPr>
+              <w:t>NQT; Vinh (test)</w:t>
+            </w:r>
+          </w:p>
+        </w:tc>
+        <w:tc>
+          <w:tcPr>
+            <w:tcW w:type="dxa" w:w="2088"/>
+            <w:vAlign w:val="center"/>
+            <w:tcMar>
+              <w:top w:w="45" w:type="dxa"/>
+              <w:start w:w="55" w:type="dxa"/>
+              <w:bottom w:w="45" w:type="dxa"/>
+              <w:end w:w="55" w:type="dxa"/>
+            </w:tcMar>
+          </w:tcPr>
+          <w:p>
+            <w:pPr>
+              <w:spacing w:after="0" w:before="0"/>
+            </w:pPr>
+            <w:r>
+              <w:rPr>
+                <w:sz w:val="16"/>
+              </w:rPr>
+              <w:t>1/10 PM – 2/10 PM</w:t>
+            </w:r>
+          </w:p>
+        </w:tc>
+        <w:tc>
+          <w:tcPr>
+            <w:tcW w:type="dxa" w:w="2592"/>
+            <w:vAlign w:val="center"/>
+            <w:tcMar>
+              <w:top w:w="45" w:type="dxa"/>
+              <w:start w:w="55" w:type="dxa"/>
+              <w:bottom w:w="45" w:type="dxa"/>
+              <w:end w:w="55" w:type="dxa"/>
+            </w:tcMar>
+          </w:tcPr>
+          <w:p>
+            <w:pPr>
+              <w:spacing w:after="0" w:before="0"/>
+            </w:pPr>
+            <w:r>
+              <w:rPr>
+                <w:sz w:val="16"/>
+              </w:rPr>
+              <w:t>NQT (108); bộ trụ ảo (32)</w:t>
+            </w:r>
+          </w:p>
+        </w:tc>
+        <w:tc>
+          <w:tcPr>
+            <w:tcW w:type="dxa" w:w="2592"/>
+            <w:vAlign w:val="center"/>
+            <w:tcMar>
+              <w:top w:w="45" w:type="dxa"/>
+              <w:start w:w="55" w:type="dxa"/>
+              <w:bottom w:w="45" w:type="dxa"/>
+              <w:end w:w="55" w:type="dxa"/>
+            </w:tcMar>
+          </w:tcPr>
+          <w:p>
+            <w:pPr>
+              <w:spacing w:after="0" w:before="0"/>
+            </w:pPr>
+            <w:r>
+              <w:rPr>
+                <w:sz w:val="16"/>
+              </w:rPr>
+              <w:t>Vinh (128, cổng QA)</w:t>
+            </w:r>
+          </w:p>
+        </w:tc>
+      </w:tr>
+      <w:tr>
+        <w:tc>
+          <w:tcPr>
+            <w:tcW w:type="dxa" w:w="936"/>
+            <w:vAlign w:val="center"/>
+            <w:tcMar>
+              <w:top w:w="45" w:type="dxa"/>
+              <w:start w:w="55" w:type="dxa"/>
+              <w:bottom w:w="45" w:type="dxa"/>
+              <w:end w:w="55" w:type="dxa"/>
+            </w:tcMar>
+          </w:tcPr>
+          <w:p>
+            <w:pPr>
+              <w:spacing w:after="0" w:before="0"/>
+            </w:pPr>
+            <w:r>
+              <w:rPr>
+                <w:sz w:val="16"/>
+              </w:rPr>
+              <w:t>50</w:t>
+            </w:r>
+          </w:p>
+        </w:tc>
+        <w:tc>
+          <w:tcPr>
+            <w:tcW w:type="dxa" w:w="3888"/>
+            <w:vAlign w:val="center"/>
+            <w:tcMar>
+              <w:top w:w="45" w:type="dxa"/>
+              <w:start w:w="55" w:type="dxa"/>
+              <w:bottom w:w="45" w:type="dxa"/>
+              <w:end w:w="55" w:type="dxa"/>
+            </w:tcMar>
+          </w:tcPr>
+          <w:p>
+            <w:pPr>
+              <w:spacing w:after="0" w:before="0"/>
+            </w:pPr>
+            <w:r>
+              <w:rPr>
+                <w:sz w:val="16"/>
+              </w:rPr>
+              <w:t>Story: Tin trùng mã nhận lại câu trả lời cũ, không xử lý hai lần. Task con: 129, 130.</w:t>
+            </w:r>
+          </w:p>
+        </w:tc>
+        <w:tc>
+          <w:tcPr>
+            <w:tcW w:type="dxa" w:w="2376"/>
+            <w:vAlign w:val="center"/>
+            <w:tcMar>
+              <w:top w:w="45" w:type="dxa"/>
+              <w:start w:w="55" w:type="dxa"/>
+              <w:bottom w:w="45" w:type="dxa"/>
+              <w:end w:w="55" w:type="dxa"/>
+            </w:tcMar>
+          </w:tcPr>
+          <w:p>
+            <w:pPr>
+              <w:spacing w:after="0" w:before="0"/>
+            </w:pPr>
+            <w:r>
+              <w:rPr>
+                <w:sz w:val="16"/>
+              </w:rPr>
+              <w:t>Tân (job); Đức (test)</w:t>
+            </w:r>
+          </w:p>
+        </w:tc>
+        <w:tc>
+          <w:tcPr>
+            <w:tcW w:type="dxa" w:w="2088"/>
+            <w:vAlign w:val="center"/>
+            <w:tcMar>
+              <w:top w:w="45" w:type="dxa"/>
+              <w:start w:w="55" w:type="dxa"/>
+              <w:bottom w:w="45" w:type="dxa"/>
+              <w:end w:w="55" w:type="dxa"/>
+            </w:tcMar>
+          </w:tcPr>
+          <w:p>
+            <w:pPr>
+              <w:spacing w:after="0" w:before="0"/>
+            </w:pPr>
+            <w:r>
+              <w:rPr>
+                <w:sz w:val="16"/>
+              </w:rPr>
+              <w:t>1/10 PM – 6/10 AM</w:t>
+            </w:r>
+          </w:p>
+        </w:tc>
+        <w:tc>
+          <w:tcPr>
+            <w:tcW w:type="dxa" w:w="2592"/>
+            <w:vAlign w:val="center"/>
+            <w:tcMar>
+              <w:top w:w="45" w:type="dxa"/>
+              <w:start w:w="55" w:type="dxa"/>
+              <w:bottom w:w="45" w:type="dxa"/>
+              <w:end w:w="55" w:type="dxa"/>
+            </w:tcMar>
+          </w:tcPr>
+          <w:p>
+            <w:pPr>
+              <w:spacing w:after="0" w:before="0"/>
+            </w:pPr>
+            <w:r>
+              <w:rPr>
+                <w:sz w:val="16"/>
+              </w:rPr>
+              <w:t>NQT (110); bảng ocpp_messages (129)</w:t>
+            </w:r>
+          </w:p>
+        </w:tc>
+        <w:tc>
+          <w:tcPr>
+            <w:tcW w:type="dxa" w:w="2592"/>
+            <w:vAlign w:val="center"/>
+            <w:tcMar>
+              <w:top w:w="45" w:type="dxa"/>
+              <w:start w:w="55" w:type="dxa"/>
+              <w:bottom w:w="45" w:type="dxa"/>
+              <w:end w:w="55" w:type="dxa"/>
+            </w:tcMar>
+          </w:tcPr>
+          <w:p>
+            <w:pPr>
+              <w:spacing w:after="0" w:before="0"/>
+            </w:pPr>
+            <w:r>
+              <w:rPr>
+                <w:sz w:val="16"/>
+              </w:rPr>
+              <w:t>Đức (130, cổng QA)</w:t>
+            </w:r>
+          </w:p>
+        </w:tc>
+      </w:tr>
+      <w:tr>
+        <w:tc>
+          <w:tcPr>
+            <w:tcW w:type="dxa" w:w="936"/>
+            <w:vAlign w:val="center"/>
+            <w:tcMar>
+              <w:top w:w="45" w:type="dxa"/>
+              <w:start w:w="55" w:type="dxa"/>
+              <w:bottom w:w="45" w:type="dxa"/>
+              <w:end w:w="55" w:type="dxa"/>
+            </w:tcMar>
+          </w:tcPr>
+          <w:p>
+            <w:pPr>
+              <w:spacing w:after="0" w:before="0"/>
+            </w:pPr>
+            <w:r>
+              <w:rPr>
+                <w:sz w:val="16"/>
+              </w:rPr>
+              <w:t>51</w:t>
+            </w:r>
+          </w:p>
+        </w:tc>
+        <w:tc>
+          <w:tcPr>
+            <w:tcW w:type="dxa" w:w="3888"/>
+            <w:vAlign w:val="center"/>
+            <w:tcMar>
+              <w:top w:w="45" w:type="dxa"/>
+              <w:start w:w="55" w:type="dxa"/>
+              <w:bottom w:w="45" w:type="dxa"/>
+              <w:end w:w="55" w:type="dxa"/>
+            </w:tcMar>
+          </w:tcPr>
+          <w:p>
+            <w:pPr>
+              <w:spacing w:after="0" w:before="0"/>
+            </w:pPr>
+            <w:r>
+              <w:rPr>
+                <w:sz w:val="16"/>
+              </w:rPr>
+              <w:t>Story: Authorize xác thực thẻ tài xế. Task con: 131, 132.</w:t>
+            </w:r>
+          </w:p>
+        </w:tc>
+        <w:tc>
+          <w:tcPr>
+            <w:tcW w:type="dxa" w:w="2376"/>
+            <w:vAlign w:val="center"/>
+            <w:tcMar>
+              <w:top w:w="45" w:type="dxa"/>
+              <w:start w:w="55" w:type="dxa"/>
+              <w:bottom w:w="45" w:type="dxa"/>
+              <w:end w:w="55" w:type="dxa"/>
+            </w:tcMar>
+          </w:tcPr>
+          <w:p>
+            <w:pPr>
+              <w:spacing w:after="0" w:before="0"/>
+            </w:pPr>
+            <w:r>
+              <w:rPr>
+                <w:sz w:val="16"/>
+              </w:rPr>
+              <w:t>Tân (bảng); NLT (handler)</w:t>
+            </w:r>
+          </w:p>
+        </w:tc>
+        <w:tc>
+          <w:tcPr>
+            <w:tcW w:type="dxa" w:w="2088"/>
+            <w:vAlign w:val="center"/>
+            <w:tcMar>
+              <w:top w:w="45" w:type="dxa"/>
+              <w:start w:w="55" w:type="dxa"/>
+              <w:bottom w:w="45" w:type="dxa"/>
+              <w:end w:w="55" w:type="dxa"/>
+            </w:tcMar>
+          </w:tcPr>
+          <w:p>
+            <w:pPr>
+              <w:spacing w:after="0" w:before="0"/>
+            </w:pPr>
+            <w:r>
+              <w:rPr>
+                <w:sz w:val="16"/>
+              </w:rPr>
+              <w:t>30/9 AM – 6/10 AM</w:t>
+            </w:r>
+          </w:p>
+        </w:tc>
+        <w:tc>
+          <w:tcPr>
+            <w:tcW w:type="dxa" w:w="2592"/>
+            <w:vAlign w:val="center"/>
+            <w:tcMar>
+              <w:top w:w="45" w:type="dxa"/>
+              <w:start w:w="55" w:type="dxa"/>
+              <w:bottom w:w="45" w:type="dxa"/>
+              <w:end w:w="55" w:type="dxa"/>
+            </w:tcMar>
+          </w:tcPr>
+          <w:p>
+            <w:pPr>
+              <w:spacing w:after="0" w:before="0"/>
+            </w:pPr>
+            <w:r>
+              <w:rPr>
+                <w:sz w:val="16"/>
+              </w:rPr>
+              <w:t>Chốt schema tại Planning; NQT (110)</w:t>
+            </w:r>
+          </w:p>
+        </w:tc>
+        <w:tc>
+          <w:tcPr>
+            <w:tcW w:type="dxa" w:w="2592"/>
+            <w:vAlign w:val="center"/>
+            <w:tcMar>
+              <w:top w:w="45" w:type="dxa"/>
+              <w:start w:w="55" w:type="dxa"/>
+              <w:bottom w:w="45" w:type="dxa"/>
+              <w:end w:w="55" w:type="dxa"/>
+            </w:tcMar>
+          </w:tcPr>
+          <w:p>
+            <w:pPr>
+              <w:spacing w:after="0" w:before="0"/>
+            </w:pPr>
+            <w:r>
+              <w:rPr>
+                <w:sz w:val="16"/>
+              </w:rPr>
+              <w:t>Đức (nghiệm thu)</w:t>
+            </w:r>
+          </w:p>
+        </w:tc>
+      </w:tr>
+      <w:tr>
+        <w:tc>
+          <w:tcPr>
+            <w:tcW w:type="dxa" w:w="936"/>
+            <w:vAlign w:val="center"/>
+            <w:tcMar>
+              <w:top w:w="45" w:type="dxa"/>
+              <w:start w:w="55" w:type="dxa"/>
+              <w:bottom w:w="45" w:type="dxa"/>
+              <w:end w:w="55" w:type="dxa"/>
+            </w:tcMar>
+          </w:tcPr>
+          <w:p>
+            <w:pPr>
+              <w:spacing w:after="0" w:before="0"/>
+            </w:pPr>
+            <w:r>
+              <w:rPr>
+                <w:sz w:val="16"/>
+              </w:rPr>
+              <w:t>52</w:t>
+            </w:r>
+          </w:p>
+        </w:tc>
+        <w:tc>
+          <w:tcPr>
+            <w:tcW w:type="dxa" w:w="3888"/>
+            <w:vAlign w:val="center"/>
+            <w:tcMar>
+              <w:top w:w="45" w:type="dxa"/>
+              <w:start w:w="55" w:type="dxa"/>
+              <w:bottom w:w="45" w:type="dxa"/>
+              <w:end w:w="55" w:type="dxa"/>
+            </w:tcMar>
+          </w:tcPr>
+          <w:p>
+            <w:pPr>
+              <w:spacing w:after="0" w:before="0"/>
+            </w:pPr>
+            <w:r>
+              <w:t>Story: Khởi động lại trụ từ xa bằng Reset. Task con: 133 (API), 134 (giao diện).</w:t>
+            </w:r>
+          </w:p>
+        </w:tc>
+        <w:tc>
+          <w:tcPr>
+            <w:tcW w:type="dxa" w:w="2376"/>
+            <w:vAlign w:val="center"/>
+            <w:tcMar>
+              <w:top w:w="45" w:type="dxa"/>
+              <w:start w:w="55" w:type="dxa"/>
+              <w:bottom w:w="45" w:type="dxa"/>
+              <w:end w:w="55" w:type="dxa"/>
+            </w:tcMar>
+          </w:tcPr>
+          <w:p>
+            <w:pPr>
+              <w:spacing w:after="0" w:before="0"/>
+            </w:pPr>
+            <w:r>
+              <w:rPr>
+                <w:sz w:val="16"/>
+              </w:rPr>
+              <w:t>NQT (API); Tú (nút/UI)</w:t>
+            </w:r>
+          </w:p>
+        </w:tc>
+        <w:tc>
+          <w:tcPr>
+            <w:tcW w:type="dxa" w:w="2088"/>
+            <w:vAlign w:val="center"/>
+            <w:tcMar>
+              <w:top w:w="45" w:type="dxa"/>
+              <w:start w:w="55" w:type="dxa"/>
+              <w:bottom w:w="45" w:type="dxa"/>
+              <w:end w:w="55" w:type="dxa"/>
+            </w:tcMar>
+          </w:tcPr>
+          <w:p>
+            <w:pPr>
+              <w:spacing w:after="0" w:before="0"/>
+            </w:pPr>
+            <w:r>
+              <w:rPr>
+                <w:sz w:val="16"/>
+              </w:rPr>
+              <w:t>NQT: 2/10 và 5/10 PM; Tú: mock 30/9–2/10, ghép 6/10 AM</w:t>
+            </w:r>
+          </w:p>
+        </w:tc>
+        <w:tc>
+          <w:tcPr>
+            <w:tcW w:type="dxa" w:w="2592"/>
+            <w:vAlign w:val="center"/>
+            <w:tcMar>
+              <w:top w:w="45" w:type="dxa"/>
+              <w:start w:w="55" w:type="dxa"/>
+              <w:bottom w:w="45" w:type="dxa"/>
+              <w:end w:w="55" w:type="dxa"/>
+            </w:tcMar>
+          </w:tcPr>
+          <w:p>
+            <w:pPr>
+              <w:spacing w:after="0" w:before="0"/>
+            </w:pPr>
+            <w:r>
+              <w:rPr>
+                <w:sz w:val="16"/>
+              </w:rPr>
+              <w:t>NQT (110,108,127); Tuấn (lưới 124); Đại (auth)</w:t>
+            </w:r>
+          </w:p>
+        </w:tc>
+        <w:tc>
+          <w:tcPr>
+            <w:tcW w:type="dxa" w:w="2592"/>
+            <w:vAlign w:val="center"/>
+            <w:tcMar>
+              <w:top w:w="45" w:type="dxa"/>
+              <w:start w:w="55" w:type="dxa"/>
+              <w:bottom w:w="45" w:type="dxa"/>
+              <w:end w:w="55" w:type="dxa"/>
+            </w:tcMar>
+          </w:tcPr>
+          <w:p>
+            <w:pPr>
+              <w:spacing w:after="0" w:before="0"/>
+            </w:pPr>
+            <w:r>
+              <w:rPr>
+                <w:sz w:val="16"/>
+              </w:rPr>
+              <w:t>Đức (test UI)</w:t>
+            </w:r>
+          </w:p>
+        </w:tc>
+      </w:tr>
+    </w:tbl>
+    <w:p>
+      <w:pPr>
+        <w:spacing w:before="160" w:after="80"/>
+      </w:pPr>
+      <w:r>
+        <w:rPr>
+          <w:b/>
+          <w:sz w:val="22"/>
+        </w:rPr>
+        <w:t>6.2 Đối chiếu mã và tên với backlog</w:t>
+      </w:r>
+    </w:p>
+    <w:tbl>
+      <w:tblPr>
+        <w:tblW w:type="auto" w:w="0"/>
+        <w:jc w:val="center"/>
+        <w:tblLayout w:type="fixed"/>
+        <w:tblLook w:firstColumn="1" w:firstRow="1" w:lastColumn="0" w:lastRow="0" w:noHBand="0" w:noVBand="1" w:val="04A0"/>
+        <w:tblBorders>
+          <w:top w:val="single" w:sz="4" w:color="A6A6A6"/>
+          <w:left w:val="single" w:sz="4" w:color="A6A6A6"/>
+          <w:bottom w:val="single" w:sz="4" w:color="A6A6A6"/>
+          <w:right w:val="single" w:sz="4" w:color="A6A6A6"/>
+          <w:insideH w:val="single" w:sz="4" w:color="A6A6A6"/>
+          <w:insideV w:val="single" w:sz="4" w:color="A6A6A6"/>
+        </w:tblBorders>
+      </w:tblPr>
+      <w:tblGrid>
+        <w:gridCol w:w="2580"/>
+        <w:gridCol w:w="2580"/>
+        <w:gridCol w:w="2580"/>
+        <w:gridCol w:w="2580"/>
+      </w:tblGrid>
+      <w:tr>
+        <w:trPr>
+          <w:tblHeader w:val="true"/>
+        </w:trPr>
+        <w:tc>
+          <w:tcPr>
+            <w:tcW w:type="dxa" w:w="1440"/>
+            <w:vAlign w:val="center"/>
+            <w:shd w:fill="D9EAF7"/>
+            <w:tcMar>
+              <w:top w:w="55" w:type="dxa"/>
+              <w:start w:w="75" w:type="dxa"/>
+              <w:bottom w:w="55" w:type="dxa"/>
+              <w:end w:w="75" w:type="dxa"/>
+            </w:tcMar>
+          </w:tcPr>
+          <w:p>
+            <w:r>
+              <w:rPr>
+                <w:b/>
+                <w:sz w:val="18"/>
+              </w:rPr>
+              <w:t>Mã trong ảnh</w:t>
+            </w:r>
+          </w:p>
+        </w:tc>
+        <w:tc>
+          <w:tcPr>
+            <w:tcW w:type="dxa" w:w="2376"/>
+            <w:vAlign w:val="center"/>
+            <w:shd w:fill="D9EAF7"/>
+            <w:tcMar>
+              <w:top w:w="55" w:type="dxa"/>
+              <w:start w:w="75" w:type="dxa"/>
+              <w:bottom w:w="55" w:type="dxa"/>
+              <w:end w:w="75" w:type="dxa"/>
+            </w:tcMar>
+          </w:tcPr>
+          <w:p>
+            <w:r>
+              <w:rPr>
+                <w:b/>
+                <w:sz w:val="18"/>
+              </w:rPr>
+              <w:t>Mục tương ứng trong backlog</w:t>
+            </w:r>
+          </w:p>
+        </w:tc>
+        <w:tc>
+          <w:tcPr>
+            <w:tcW w:type="dxa" w:w="3672"/>
+            <w:vAlign w:val="center"/>
+            <w:shd w:fill="D9EAF7"/>
+            <w:tcMar>
+              <w:top w:w="55" w:type="dxa"/>
+              <w:start w:w="75" w:type="dxa"/>
+              <w:bottom w:w="55" w:type="dxa"/>
+              <w:end w:w="75" w:type="dxa"/>
+            </w:tcMar>
+          </w:tcPr>
+          <w:p>
+            <w:r>
+              <w:rPr>
+                <w:b/>
+                <w:sz w:val="18"/>
+              </w:rPr>
+              <w:t>Người phụ trách theo kế hoạch</w:t>
+            </w:r>
+          </w:p>
+        </w:tc>
+        <w:tc>
+          <w:tcPr>
+            <w:tcW w:type="dxa" w:w="6912"/>
+            <w:vAlign w:val="center"/>
+            <w:shd w:fill="D9EAF7"/>
+            <w:tcMar>
+              <w:top w:w="55" w:type="dxa"/>
+              <w:start w:w="75" w:type="dxa"/>
+              <w:bottom w:w="55" w:type="dxa"/>
+              <w:end w:w="75" w:type="dxa"/>
+            </w:tcMar>
+          </w:tcPr>
+          <w:p>
+            <w:r>
+              <w:rPr>
+                <w:b/>
+                <w:sz w:val="18"/>
+              </w:rPr>
+              <w:t>Kết quả đối chiếu</w:t>
+            </w:r>
+          </w:p>
+        </w:tc>
+      </w:tr>
+      <w:tr>
+        <w:tc>
+          <w:tcPr>
+            <w:tcW w:type="dxa" w:w="1440"/>
+            <w:vAlign w:val="center"/>
+            <w:tcMar>
+              <w:top w:w="55" w:type="dxa"/>
+              <w:start w:w="75" w:type="dxa"/>
+              <w:bottom w:w="55" w:type="dxa"/>
+              <w:end w:w="75" w:type="dxa"/>
+            </w:tcMar>
+          </w:tcPr>
+          <w:p>
+            <w:pPr>
+              <w:spacing w:after="0" w:before="0"/>
+            </w:pPr>
+            <w:r>
+              <w:rPr>
+                <w:sz w:val="17"/>
+              </w:rPr>
+              <w:t>SCRUM-119</w:t>
+            </w:r>
+          </w:p>
+        </w:tc>
+        <w:tc>
+          <w:tcPr>
+            <w:tcW w:type="dxa" w:w="2376"/>
+            <w:vAlign w:val="center"/>
+            <w:tcMar>
+              <w:top w:w="55" w:type="dxa"/>
+              <w:start w:w="75" w:type="dxa"/>
+              <w:bottom w:w="55" w:type="dxa"/>
+              <w:end w:w="75" w:type="dxa"/>
+            </w:tcMar>
+          </w:tcPr>
+          <w:p>
+            <w:pPr>
+              <w:spacing w:after="0"/>
+            </w:pPr>
+            <w:r>
+              <w:rPr>
+                <w:sz w:val="17"/>
+              </w:rPr>
+              <w:t>T-20 / S-10 — Ánh xạ trạng thái OCPP sang trạng thái nội bộ của bảng connectors</w:t>
+            </w:r>
+          </w:p>
+        </w:tc>
+        <w:tc>
+          <w:tcPr>
+            <w:tcW w:type="dxa" w:w="3672"/>
+            <w:vAlign w:val="center"/>
+            <w:tcMar>
+              <w:top w:w="55" w:type="dxa"/>
+              <w:start w:w="75" w:type="dxa"/>
+              <w:bottom w:w="55" w:type="dxa"/>
+              <w:end w:w="75" w:type="dxa"/>
+            </w:tcMar>
+          </w:tcPr>
+          <w:p>
+            <w:pPr>
+              <w:spacing w:after="0" w:before="0"/>
+            </w:pPr>
+            <w:r>
+              <w:rPr>
+                <w:sz w:val="17"/>
+              </w:rPr>
+              <w:t>NLT</w:t>
+            </w:r>
+          </w:p>
+        </w:tc>
+        <w:tc>
+          <w:tcPr>
+            <w:tcW w:type="dxa" w:w="6912"/>
+            <w:vAlign w:val="center"/>
+            <w:tcMar>
+              <w:top w:w="55" w:type="dxa"/>
+              <w:start w:w="75" w:type="dxa"/>
+              <w:bottom w:w="55" w:type="dxa"/>
+              <w:end w:w="75" w:type="dxa"/>
+            </w:tcMar>
+          </w:tcPr>
+          <w:p>
+            <w:pPr>
+              <w:spacing w:after="0"/>
+            </w:pPr>
+            <w:r>
+              <w:rPr>
+                <w:sz w:val="17"/>
+              </w:rPr>
+              <w:t>Đã giao trong kế hoạch; nội dung khớp.</w:t>
+            </w:r>
+          </w:p>
+        </w:tc>
+      </w:tr>
+      <w:tr>
+        <w:tc>
+          <w:tcPr>
+            <w:tcW w:type="dxa" w:w="1440"/>
+            <w:vAlign w:val="center"/>
+            <w:tcMar>
+              <w:top w:w="55" w:type="dxa"/>
+              <w:start w:w="75" w:type="dxa"/>
+              <w:bottom w:w="55" w:type="dxa"/>
+              <w:end w:w="75" w:type="dxa"/>
+            </w:tcMar>
+          </w:tcPr>
+          <w:p>
+            <w:pPr>
+              <w:spacing w:after="0" w:before="0"/>
+            </w:pPr>
+            <w:r>
+              <w:rPr>
+                <w:sz w:val="17"/>
+              </w:rPr>
+              <w:t>SCRUM-32</w:t>
+            </w:r>
+          </w:p>
+        </w:tc>
+        <w:tc>
+          <w:tcPr>
+            <w:tcW w:type="dxa" w:w="2376"/>
+            <w:vAlign w:val="center"/>
+            <w:tcMar>
+              <w:top w:w="55" w:type="dxa"/>
+              <w:start w:w="75" w:type="dxa"/>
+              <w:bottom w:w="55" w:type="dxa"/>
+              <w:end w:w="75" w:type="dxa"/>
+            </w:tcMar>
+          </w:tcPr>
+          <w:p>
+            <w:pPr>
+              <w:spacing w:after="0"/>
+            </w:pPr>
+            <w:r>
+              <w:rPr>
+                <w:sz w:val="17"/>
+              </w:rPr>
+              <w:t>S-26 — Bộ trụ ảo chạy trong docker-compose và trong CI</w:t>
+            </w:r>
+          </w:p>
+        </w:tc>
+        <w:tc>
+          <w:tcPr>
+            <w:tcW w:type="dxa" w:w="3672"/>
+            <w:vAlign w:val="center"/>
+            <w:tcMar>
+              <w:top w:w="55" w:type="dxa"/>
+              <w:start w:w="75" w:type="dxa"/>
+              <w:bottom w:w="55" w:type="dxa"/>
+              <w:end w:w="75" w:type="dxa"/>
+            </w:tcMar>
+          </w:tcPr>
+          <w:p>
+            <w:pPr>
+              <w:spacing w:after="0" w:before="0"/>
+            </w:pPr>
+            <w:r>
+              <w:rPr>
+                <w:sz w:val="17"/>
+              </w:rPr>
+              <w:t>Vinh; Tân hỗ trợ CI</w:t>
+            </w:r>
+          </w:p>
+        </w:tc>
+        <w:tc>
+          <w:tcPr>
+            <w:tcW w:type="dxa" w:w="6912"/>
+            <w:vAlign w:val="center"/>
+            <w:tcMar>
+              <w:top w:w="55" w:type="dxa"/>
+              <w:start w:w="75" w:type="dxa"/>
+              <w:bottom w:w="55" w:type="dxa"/>
+              <w:end w:w="75" w:type="dxa"/>
+            </w:tcMar>
+          </w:tcPr>
+          <w:p>
+            <w:pPr>
+              <w:spacing w:after="0"/>
+            </w:pPr>
+            <w:r>
+              <w:rPr>
+                <w:sz w:val="17"/>
+              </w:rPr>
+              <w:t>Tên khớp. Lưu ý: backlog xếp S-26 ở Sprint 3, còn kế hoạch này đưa vào Sprint 2.</w:t>
+            </w:r>
+          </w:p>
+        </w:tc>
+      </w:tr>
+      <w:tr>
+        <w:tc>
+          <w:tcPr>
+            <w:tcW w:type="dxa" w:w="1440"/>
+            <w:vAlign w:val="center"/>
+            <w:tcMar>
+              <w:top w:w="55" w:type="dxa"/>
+              <w:start w:w="75" w:type="dxa"/>
+              <w:bottom w:w="55" w:type="dxa"/>
+              <w:end w:w="75" w:type="dxa"/>
+            </w:tcMar>
+          </w:tcPr>
+          <w:p>
+            <w:pPr>
+              <w:spacing w:after="0" w:before="0"/>
+            </w:pPr>
+            <w:r>
+              <w:rPr>
+                <w:sz w:val="17"/>
+              </w:rPr>
+              <w:t>SCRUM-118</w:t>
+            </w:r>
+          </w:p>
+        </w:tc>
+        <w:tc>
+          <w:tcPr>
+            <w:tcW w:type="dxa" w:w="2376"/>
+            <w:vAlign w:val="center"/>
+            <w:tcMar>
+              <w:top w:w="55" w:type="dxa"/>
+              <w:start w:w="75" w:type="dxa"/>
+              <w:bottom w:w="55" w:type="dxa"/>
+              <w:end w:w="75" w:type="dxa"/>
+            </w:tcMar>
+          </w:tcPr>
+          <w:p>
+            <w:pPr>
+              <w:spacing w:after="0"/>
+            </w:pPr>
+            <w:r>
+              <w:rPr>
+                <w:sz w:val="17"/>
+              </w:rPr>
+              <w:t>T-19 / S-09 — Test nhịp tim với trụ ảo đặt sai giờ hệ thống</w:t>
+            </w:r>
+          </w:p>
+        </w:tc>
+        <w:tc>
+          <w:tcPr>
+            <w:tcW w:type="dxa" w:w="3672"/>
+            <w:vAlign w:val="center"/>
+            <w:tcMar>
+              <w:top w:w="55" w:type="dxa"/>
+              <w:start w:w="75" w:type="dxa"/>
+              <w:bottom w:w="55" w:type="dxa"/>
+              <w:end w:w="75" w:type="dxa"/>
+            </w:tcMar>
+          </w:tcPr>
+          <w:p>
+            <w:pPr>
+              <w:spacing w:after="0" w:before="0"/>
+            </w:pPr>
+            <w:r>
+              <w:rPr>
+                <w:sz w:val="17"/>
+              </w:rPr>
+              <w:t>Vinh</w:t>
+            </w:r>
+          </w:p>
+        </w:tc>
+        <w:tc>
+          <w:tcPr>
+            <w:tcW w:type="dxa" w:w="6912"/>
+            <w:vAlign w:val="center"/>
+            <w:tcMar>
+              <w:top w:w="55" w:type="dxa"/>
+              <w:start w:w="75" w:type="dxa"/>
+              <w:bottom w:w="55" w:type="dxa"/>
+              <w:end w:w="75" w:type="dxa"/>
+            </w:tcMar>
+          </w:tcPr>
+          <w:p>
+            <w:pPr>
+              <w:spacing w:after="0"/>
+            </w:pPr>
+            <w:r>
+              <w:rPr>
+                <w:sz w:val="17"/>
+              </w:rPr>
+              <w:t>Đã giao trong kế hoạch; nội dung khớp.</w:t>
+            </w:r>
+          </w:p>
+        </w:tc>
+      </w:tr>
+      <w:tr>
+        <w:tc>
+          <w:tcPr>
+            <w:tcW w:type="dxa" w:w="1440"/>
+            <w:vAlign w:val="center"/>
+            <w:tcMar>
+              <w:top w:w="55" w:type="dxa"/>
+              <w:start w:w="75" w:type="dxa"/>
+              <w:bottom w:w="55" w:type="dxa"/>
+              <w:end w:w="75" w:type="dxa"/>
+            </w:tcMar>
+          </w:tcPr>
+          <w:p>
+            <w:pPr>
+              <w:spacing w:after="0" w:before="0"/>
+            </w:pPr>
+            <w:r>
+              <w:rPr>
+                <w:sz w:val="17"/>
+              </w:rPr>
+              <w:t>SCRUM-120</w:t>
+            </w:r>
+          </w:p>
+        </w:tc>
+        <w:tc>
+          <w:tcPr>
+            <w:tcW w:type="dxa" w:w="2376"/>
+            <w:vAlign w:val="center"/>
+            <w:tcMar>
+              <w:top w:w="55" w:type="dxa"/>
+              <w:start w:w="75" w:type="dxa"/>
+              <w:bottom w:w="55" w:type="dxa"/>
+              <w:end w:w="75" w:type="dxa"/>
+            </w:tcMar>
+          </w:tcPr>
+          <w:p>
+            <w:pPr>
+              <w:spacing w:after="0"/>
+            </w:pPr>
+            <w:r>
+              <w:rPr>
+                <w:sz w:val="17"/>
+              </w:rPr>
+              <w:t>T-21 / S-10 — Lưu mã lỗi và thời điểm vào connector_errors</w:t>
+            </w:r>
+          </w:p>
+        </w:tc>
+        <w:tc>
+          <w:tcPr>
+            <w:tcW w:type="dxa" w:w="3672"/>
+            <w:vAlign w:val="center"/>
+            <w:tcMar>
+              <w:top w:w="55" w:type="dxa"/>
+              <w:start w:w="75" w:type="dxa"/>
+              <w:bottom w:w="55" w:type="dxa"/>
+              <w:end w:w="75" w:type="dxa"/>
+            </w:tcMar>
+          </w:tcPr>
+          <w:p>
+            <w:pPr>
+              <w:spacing w:after="0" w:before="0"/>
+            </w:pPr>
+            <w:r>
+              <w:rPr>
+                <w:sz w:val="17"/>
+              </w:rPr>
+              <w:t>NLT</w:t>
+            </w:r>
+          </w:p>
+        </w:tc>
+        <w:tc>
+          <w:tcPr>
+            <w:tcW w:type="dxa" w:w="6912"/>
+            <w:vAlign w:val="center"/>
+            <w:tcMar>
+              <w:top w:w="55" w:type="dxa"/>
+              <w:start w:w="75" w:type="dxa"/>
+              <w:bottom w:w="55" w:type="dxa"/>
+              <w:end w:w="75" w:type="dxa"/>
+            </w:tcMar>
+          </w:tcPr>
+          <w:p>
+            <w:pPr>
+              <w:spacing w:after="0"/>
+            </w:pPr>
+            <w:r>
+              <w:rPr>
+                <w:sz w:val="17"/>
+              </w:rPr>
+              <w:t>Đã giao trong kế hoạch; nội dung khớp.</w:t>
+            </w:r>
+          </w:p>
+        </w:tc>
+      </w:tr>
+      <w:tr>
+        <w:tc>
+          <w:tcPr>
+            <w:tcW w:type="dxa" w:w="1440"/>
+            <w:vAlign w:val="center"/>
+            <w:tcMar>
+              <w:top w:w="55" w:type="dxa"/>
+              <w:start w:w="75" w:type="dxa"/>
+              <w:bottom w:w="55" w:type="dxa"/>
+              <w:end w:w="75" w:type="dxa"/>
+            </w:tcMar>
+          </w:tcPr>
+          <w:p>
+            <w:pPr>
+              <w:spacing w:after="0" w:before="0"/>
+            </w:pPr>
+            <w:r>
+              <w:rPr>
+                <w:sz w:val="17"/>
+              </w:rPr>
+              <w:t>SCRUM-121</w:t>
+            </w:r>
+          </w:p>
+        </w:tc>
+        <w:tc>
+          <w:tcPr>
+            <w:tcW w:type="dxa" w:w="2376"/>
+            <w:vAlign w:val="center"/>
+            <w:tcMar>
+              <w:top w:w="55" w:type="dxa"/>
+              <w:start w:w="75" w:type="dxa"/>
+              <w:bottom w:w="55" w:type="dxa"/>
+              <w:end w:w="75" w:type="dxa"/>
+            </w:tcMar>
+          </w:tcPr>
+          <w:p>
+            <w:pPr>
+              <w:spacing w:after="0"/>
+            </w:pPr>
+            <w:r>
+              <w:rPr>
+                <w:sz w:val="17"/>
+              </w:rPr>
+              <w:t>T-22 / S-10 — Bỏ qua đầu nối chưa khai báo kèm cảnh báo, không tạo mới</w:t>
+            </w:r>
+          </w:p>
+        </w:tc>
+        <w:tc>
+          <w:tcPr>
+            <w:tcW w:type="dxa" w:w="3672"/>
+            <w:vAlign w:val="center"/>
+            <w:tcMar>
+              <w:top w:w="55" w:type="dxa"/>
+              <w:start w:w="75" w:type="dxa"/>
+              <w:bottom w:w="55" w:type="dxa"/>
+              <w:end w:w="75" w:type="dxa"/>
+            </w:tcMar>
+          </w:tcPr>
+          <w:p>
+            <w:pPr>
+              <w:spacing w:after="0" w:before="0"/>
+            </w:pPr>
+            <w:r>
+              <w:rPr>
+                <w:sz w:val="17"/>
+              </w:rPr>
+              <w:t>NLT</w:t>
+            </w:r>
+          </w:p>
+        </w:tc>
+        <w:tc>
+          <w:tcPr>
+            <w:tcW w:type="dxa" w:w="6912"/>
+            <w:vAlign w:val="center"/>
+            <w:tcMar>
+              <w:top w:w="55" w:type="dxa"/>
+              <w:start w:w="75" w:type="dxa"/>
+              <w:bottom w:w="55" w:type="dxa"/>
+              <w:end w:w="75" w:type="dxa"/>
+            </w:tcMar>
+          </w:tcPr>
+          <w:p>
+            <w:pPr>
+              <w:spacing w:after="0"/>
+            </w:pPr>
+            <w:r>
+              <w:rPr>
+                <w:sz w:val="17"/>
+              </w:rPr>
+              <w:t>Đã giao trong kế hoạch; nội dung khớp.</w:t>
+            </w:r>
+          </w:p>
+        </w:tc>
+      </w:tr>
+      <w:tr>
+        <w:tc>
+          <w:tcPr>
+            <w:tcW w:type="dxa" w:w="1440"/>
+            <w:vAlign w:val="center"/>
+            <w:tcMar>
+              <w:top w:w="55" w:type="dxa"/>
+              <w:start w:w="75" w:type="dxa"/>
+              <w:bottom w:w="55" w:type="dxa"/>
+              <w:end w:w="75" w:type="dxa"/>
+            </w:tcMar>
+          </w:tcPr>
+          <w:p>
+            <w:pPr>
+              <w:spacing w:after="0" w:before="0"/>
+            </w:pPr>
+            <w:r>
+              <w:rPr>
+                <w:sz w:val="17"/>
+              </w:rPr>
+              <w:t>SCRUM-123</w:t>
+            </w:r>
+          </w:p>
+        </w:tc>
+        <w:tc>
+          <w:tcPr>
+            <w:tcW w:type="dxa" w:w="2376"/>
+            <w:vAlign w:val="center"/>
+            <w:tcMar>
+              <w:top w:w="55" w:type="dxa"/>
+              <w:start w:w="75" w:type="dxa"/>
+              <w:bottom w:w="55" w:type="dxa"/>
+              <w:end w:w="75" w:type="dxa"/>
+            </w:tcMar>
+          </w:tcPr>
+          <w:p>
+            <w:pPr>
+              <w:spacing w:after="0"/>
+            </w:pPr>
+            <w:r>
+              <w:rPr>
+                <w:sz w:val="17"/>
+              </w:rPr>
+              <w:t>T-25 / S-11 — Kênh đẩy trạng thái xuống trình duyệt khi đầu nối đổi</w:t>
+            </w:r>
+          </w:p>
+        </w:tc>
+        <w:tc>
+          <w:tcPr>
+            <w:tcW w:type="dxa" w:w="3672"/>
+            <w:vAlign w:val="center"/>
+            <w:tcMar>
+              <w:top w:w="55" w:type="dxa"/>
+              <w:start w:w="75" w:type="dxa"/>
+              <w:bottom w:w="55" w:type="dxa"/>
+              <w:end w:w="75" w:type="dxa"/>
+            </w:tcMar>
+          </w:tcPr>
+          <w:p>
+            <w:pPr>
+              <w:spacing w:after="0" w:before="0"/>
+            </w:pPr>
+            <w:r>
+              <w:rPr>
+                <w:sz w:val="17"/>
+              </w:rPr>
+              <w:t>NQT; Tú làm hook realtime</w:t>
+            </w:r>
+          </w:p>
+        </w:tc>
+        <w:tc>
+          <w:tcPr>
+            <w:tcW w:type="dxa" w:w="6912"/>
+            <w:vAlign w:val="center"/>
+            <w:tcMar>
+              <w:top w:w="55" w:type="dxa"/>
+              <w:start w:w="75" w:type="dxa"/>
+              <w:bottom w:w="55" w:type="dxa"/>
+              <w:end w:w="75" w:type="dxa"/>
+            </w:tcMar>
+          </w:tcPr>
+          <w:p>
+            <w:pPr>
+              <w:spacing w:after="0"/>
+            </w:pPr>
+            <w:r>
+              <w:rPr>
+                <w:sz w:val="17"/>
+              </w:rPr>
+              <w:t>Đã giao trong kế hoạch; nội dung khớp.</w:t>
+            </w:r>
+          </w:p>
+        </w:tc>
+      </w:tr>
+      <w:tr>
+        <w:tc>
+          <w:tcPr>
+            <w:tcW w:type="dxa" w:w="1440"/>
+            <w:vAlign w:val="center"/>
+            <w:tcMar>
+              <w:top w:w="55" w:type="dxa"/>
+              <w:start w:w="75" w:type="dxa"/>
+              <w:bottom w:w="55" w:type="dxa"/>
+              <w:end w:w="75" w:type="dxa"/>
+            </w:tcMar>
+          </w:tcPr>
+          <w:p>
+            <w:pPr>
+              <w:spacing w:after="0" w:before="0"/>
+            </w:pPr>
+            <w:r>
+              <w:rPr>
+                <w:sz w:val="17"/>
+              </w:rPr>
+              <w:t>SCRUM-124</w:t>
+            </w:r>
+          </w:p>
+        </w:tc>
+        <w:tc>
+          <w:tcPr>
+            <w:tcW w:type="dxa" w:w="2376"/>
+            <w:vAlign w:val="center"/>
+            <w:tcMar>
+              <w:top w:w="55" w:type="dxa"/>
+              <w:start w:w="75" w:type="dxa"/>
+              <w:bottom w:w="55" w:type="dxa"/>
+              <w:end w:w="75" w:type="dxa"/>
+            </w:tcMar>
+          </w:tcPr>
+          <w:p>
+            <w:pPr>
+              <w:spacing w:after="0"/>
+            </w:pPr>
+            <w:r>
+              <w:rPr>
+                <w:sz w:val="17"/>
+              </w:rPr>
+              <w:t>T-24 / S-11 — Màn hình theo dõi dạng lưới, mỗi ô một trụ, nhãn chữ kèm màu</w:t>
+            </w:r>
+          </w:p>
+        </w:tc>
+        <w:tc>
+          <w:tcPr>
+            <w:tcW w:type="dxa" w:w="3672"/>
+            <w:vAlign w:val="center"/>
+            <w:tcMar>
+              <w:top w:w="55" w:type="dxa"/>
+              <w:start w:w="75" w:type="dxa"/>
+              <w:bottom w:w="55" w:type="dxa"/>
+              <w:end w:w="75" w:type="dxa"/>
+            </w:tcMar>
+          </w:tcPr>
+          <w:p>
+            <w:pPr>
+              <w:spacing w:after="0" w:before="0"/>
+            </w:pPr>
+            <w:r>
+              <w:rPr>
+                <w:sz w:val="17"/>
+              </w:rPr>
+              <w:t>Tuấn</w:t>
+            </w:r>
+          </w:p>
+        </w:tc>
+        <w:tc>
+          <w:tcPr>
+            <w:tcW w:type="dxa" w:w="6912"/>
+            <w:vAlign w:val="center"/>
+            <w:tcMar>
+              <w:top w:w="55" w:type="dxa"/>
+              <w:start w:w="75" w:type="dxa"/>
+              <w:bottom w:w="55" w:type="dxa"/>
+              <w:end w:w="75" w:type="dxa"/>
+            </w:tcMar>
+          </w:tcPr>
+          <w:p>
+            <w:pPr>
+              <w:spacing w:after="0"/>
+            </w:pPr>
+            <w:r>
+              <w:rPr>
+                <w:sz w:val="17"/>
+              </w:rPr>
+              <w:t>Đã giao trong kế hoạch; nội dung khớp.</w:t>
+            </w:r>
+          </w:p>
+        </w:tc>
+      </w:tr>
+      <w:tr>
+        <w:tc>
+          <w:tcPr>
+            <w:tcW w:type="dxa" w:w="1440"/>
+            <w:vAlign w:val="center"/>
+            <w:tcMar>
+              <w:top w:w="55" w:type="dxa"/>
+              <w:start w:w="75" w:type="dxa"/>
+              <w:bottom w:w="55" w:type="dxa"/>
+              <w:end w:w="75" w:type="dxa"/>
+            </w:tcMar>
+          </w:tcPr>
+          <w:p>
+            <w:pPr>
+              <w:spacing w:after="0" w:before="0"/>
+            </w:pPr>
+            <w:r>
+              <w:rPr>
+                <w:sz w:val="17"/>
+              </w:rPr>
+              <w:t>SCRUM-126</w:t>
+            </w:r>
+          </w:p>
+        </w:tc>
+        <w:tc>
+          <w:tcPr>
+            <w:tcW w:type="dxa" w:w="2376"/>
+            <w:vAlign w:val="center"/>
+            <w:tcMar>
+              <w:top w:w="55" w:type="dxa"/>
+              <w:start w:w="75" w:type="dxa"/>
+              <w:bottom w:w="55" w:type="dxa"/>
+              <w:end w:w="75" w:type="dxa"/>
+            </w:tcMar>
+          </w:tcPr>
+          <w:p>
+            <w:pPr>
+              <w:spacing w:after="0"/>
+            </w:pPr>
+            <w:r>
+              <w:rPr>
+                <w:sz w:val="17"/>
+              </w:rPr>
+              <w:t>T-27 / S-12 — Test dừng trụ ảo rồi bật lại, trạng thái đi đúng hai chiều</w:t>
+            </w:r>
+          </w:p>
+        </w:tc>
+        <w:tc>
+          <w:tcPr>
+            <w:tcW w:type="dxa" w:w="3672"/>
+            <w:vAlign w:val="center"/>
+            <w:tcMar>
+              <w:top w:w="55" w:type="dxa"/>
+              <w:start w:w="75" w:type="dxa"/>
+              <w:bottom w:w="55" w:type="dxa"/>
+              <w:end w:w="75" w:type="dxa"/>
+            </w:tcMar>
+          </w:tcPr>
+          <w:p>
+            <w:pPr>
+              <w:spacing w:after="0" w:before="0"/>
+            </w:pPr>
+            <w:r>
+              <w:rPr>
+                <w:sz w:val="17"/>
+              </w:rPr>
+              <w:t>Đức</w:t>
+            </w:r>
+          </w:p>
+        </w:tc>
+        <w:tc>
+          <w:tcPr>
+            <w:tcW w:type="dxa" w:w="6912"/>
+            <w:vAlign w:val="center"/>
+            <w:tcMar>
+              <w:top w:w="55" w:type="dxa"/>
+              <w:start w:w="75" w:type="dxa"/>
+              <w:bottom w:w="55" w:type="dxa"/>
+              <w:end w:w="75" w:type="dxa"/>
+            </w:tcMar>
+          </w:tcPr>
+          <w:p>
+            <w:pPr>
+              <w:spacing w:after="0"/>
+            </w:pPr>
+            <w:r>
+              <w:rPr>
+                <w:sz w:val="17"/>
+              </w:rPr>
+              <w:t>Đã giao trong kế hoạch; nội dung khớp.</w:t>
+            </w:r>
+          </w:p>
+        </w:tc>
+      </w:tr>
+      <w:tr>
+        <w:tc>
+          <w:tcPr>
+            <w:tcW w:type="dxa" w:w="1440"/>
+            <w:vAlign w:val="center"/>
+            <w:tcMar>
+              <w:top w:w="55" w:type="dxa"/>
+              <w:start w:w="75" w:type="dxa"/>
+              <w:bottom w:w="55" w:type="dxa"/>
+              <w:end w:w="75" w:type="dxa"/>
+            </w:tcMar>
+          </w:tcPr>
+          <w:p>
+            <w:pPr>
+              <w:spacing w:after="0" w:before="0"/>
+            </w:pPr>
+            <w:r>
+              <w:rPr>
+                <w:sz w:val="17"/>
+              </w:rPr>
+              <w:t>SCRUM-128</w:t>
+            </w:r>
+          </w:p>
+        </w:tc>
+        <w:tc>
+          <w:tcPr>
+            <w:tcW w:type="dxa" w:w="2376"/>
+            <w:vAlign w:val="center"/>
+            <w:tcMar>
+              <w:top w:w="55" w:type="dxa"/>
+              <w:start w:w="75" w:type="dxa"/>
+              <w:bottom w:w="55" w:type="dxa"/>
+              <w:end w:w="75" w:type="dxa"/>
+            </w:tcMar>
+          </w:tcPr>
+          <w:p>
+            <w:pPr>
+              <w:spacing w:after="0"/>
+            </w:pPr>
+            <w:r>
+              <w:rPr>
+                <w:sz w:val="17"/>
+              </w:rPr>
+              <w:t>T-29 / S-13 — Test mở hai trụ ảo cùng mã, kết nối đầu nhận khung đóng</w:t>
+            </w:r>
+          </w:p>
+        </w:tc>
+        <w:tc>
+          <w:tcPr>
+            <w:tcW w:type="dxa" w:w="3672"/>
+            <w:vAlign w:val="center"/>
+            <w:tcMar>
+              <w:top w:w="55" w:type="dxa"/>
+              <w:start w:w="75" w:type="dxa"/>
+              <w:bottom w:w="55" w:type="dxa"/>
+              <w:end w:w="75" w:type="dxa"/>
+            </w:tcMar>
+          </w:tcPr>
+          <w:p>
+            <w:pPr>
+              <w:spacing w:after="0" w:before="0"/>
+            </w:pPr>
+            <w:r>
+              <w:rPr>
+                <w:sz w:val="17"/>
+              </w:rPr>
+              <w:t>Vinh</w:t>
+            </w:r>
+          </w:p>
+        </w:tc>
+        <w:tc>
+          <w:tcPr>
+            <w:tcW w:type="dxa" w:w="6912"/>
+            <w:vAlign w:val="center"/>
+            <w:tcMar>
+              <w:top w:w="55" w:type="dxa"/>
+              <w:start w:w="75" w:type="dxa"/>
+              <w:bottom w:w="55" w:type="dxa"/>
+              <w:end w:w="75" w:type="dxa"/>
+            </w:tcMar>
+          </w:tcPr>
+          <w:p>
+            <w:pPr>
+              <w:spacing w:after="0"/>
+            </w:pPr>
+            <w:r>
+              <w:rPr>
+                <w:sz w:val="17"/>
+              </w:rPr>
+              <w:t>Đã giao trong kế hoạch; cùng nội dung. Tiêu đề workbook có thêm từ “khung”.</w:t>
+            </w:r>
+          </w:p>
+        </w:tc>
+      </w:tr>
+      <w:tr>
+        <w:tc>
+          <w:tcPr>
+            <w:tcW w:type="dxa" w:w="1440"/>
+            <w:vAlign w:val="center"/>
+            <w:tcMar>
+              <w:top w:w="55" w:type="dxa"/>
+              <w:start w:w="75" w:type="dxa"/>
+              <w:bottom w:w="55" w:type="dxa"/>
+              <w:end w:w="75" w:type="dxa"/>
+            </w:tcMar>
+          </w:tcPr>
+          <w:p>
+            <w:pPr>
+              <w:spacing w:after="0" w:before="0"/>
+            </w:pPr>
+            <w:r>
+              <w:rPr>
+                <w:sz w:val="17"/>
+              </w:rPr>
+              <w:t>SCRUM-132</w:t>
+            </w:r>
+          </w:p>
+        </w:tc>
+        <w:tc>
+          <w:tcPr>
+            <w:tcW w:type="dxa" w:w="2376"/>
+            <w:vAlign w:val="center"/>
+            <w:tcMar>
+              <w:top w:w="55" w:type="dxa"/>
+              <w:start w:w="75" w:type="dxa"/>
+              <w:bottom w:w="55" w:type="dxa"/>
+              <w:end w:w="75" w:type="dxa"/>
+            </w:tcMar>
+          </w:tcPr>
+          <w:p>
+            <w:pPr>
+              <w:spacing w:after="0"/>
+            </w:pPr>
+            <w:r>
+              <w:rPr>
+                <w:sz w:val="17"/>
+              </w:rPr>
+              <w:t>T-33 / S-15 — Handler Authorize trả Accepted, Blocked, Expired hoặc Invalid</w:t>
+            </w:r>
+          </w:p>
+        </w:tc>
+        <w:tc>
+          <w:tcPr>
+            <w:tcW w:type="dxa" w:w="3672"/>
+            <w:vAlign w:val="center"/>
+            <w:tcMar>
+              <w:top w:w="55" w:type="dxa"/>
+              <w:start w:w="75" w:type="dxa"/>
+              <w:bottom w:w="55" w:type="dxa"/>
+              <w:end w:w="75" w:type="dxa"/>
+            </w:tcMar>
+          </w:tcPr>
+          <w:p>
+            <w:pPr>
+              <w:spacing w:after="0" w:before="0"/>
+            </w:pPr>
+            <w:r>
+              <w:rPr>
+                <w:sz w:val="17"/>
+              </w:rPr>
+              <w:t>NLT</w:t>
+            </w:r>
+          </w:p>
+        </w:tc>
+        <w:tc>
+          <w:tcPr>
+            <w:tcW w:type="dxa" w:w="6912"/>
+            <w:vAlign w:val="center"/>
+            <w:tcMar>
+              <w:top w:w="55" w:type="dxa"/>
+              <w:start w:w="75" w:type="dxa"/>
+              <w:bottom w:w="55" w:type="dxa"/>
+              <w:end w:w="75" w:type="dxa"/>
+            </w:tcMar>
+          </w:tcPr>
+          <w:p>
+            <w:pPr>
+              <w:spacing w:after="0"/>
+            </w:pPr>
+            <w:r>
+              <w:rPr>
+                <w:sz w:val="17"/>
+              </w:rPr>
+              <w:t>Đã giao trong kế hoạch; nội dung khớp.</w:t>
+            </w:r>
+          </w:p>
+        </w:tc>
+      </w:tr>
+      <w:tr>
+        <w:tc>
+          <w:tcPr>
+            <w:tcW w:type="dxa" w:w="1440"/>
+            <w:vAlign w:val="center"/>
+            <w:tcMar>
+              <w:top w:w="55" w:type="dxa"/>
+              <w:start w:w="75" w:type="dxa"/>
+              <w:bottom w:w="55" w:type="dxa"/>
+              <w:end w:w="75" w:type="dxa"/>
+            </w:tcMar>
+          </w:tcPr>
+          <w:p>
+            <w:pPr>
+              <w:spacing w:after="0" w:before="0"/>
+            </w:pPr>
+            <w:r>
+              <w:rPr>
+                <w:sz w:val="17"/>
+              </w:rPr>
+              <w:t>SCRUM-133</w:t>
+            </w:r>
+          </w:p>
+        </w:tc>
+        <w:tc>
+          <w:tcPr>
+            <w:tcW w:type="dxa" w:w="2376"/>
+            <w:vAlign w:val="center"/>
+            <w:tcMar>
+              <w:top w:w="55" w:type="dxa"/>
+              <w:start w:w="75" w:type="dxa"/>
+              <w:bottom w:w="55" w:type="dxa"/>
+              <w:end w:w="75" w:type="dxa"/>
+            </w:tcMar>
+          </w:tcPr>
+          <w:p>
+            <w:pPr>
+              <w:spacing w:after="0"/>
+            </w:pPr>
+            <w:r>
+              <w:rPr>
+                <w:sz w:val="17"/>
+              </w:rPr>
+              <w:t>T-34 / S-16 — Gửi CALL từ máy chủ tới trụ và khớp CALLRESULT theo mã tin nhắn</w:t>
+            </w:r>
+          </w:p>
+        </w:tc>
+        <w:tc>
+          <w:tcPr>
+            <w:tcW w:type="dxa" w:w="3672"/>
+            <w:vAlign w:val="center"/>
+            <w:tcMar>
+              <w:top w:w="55" w:type="dxa"/>
+              <w:start w:w="75" w:type="dxa"/>
+              <w:bottom w:w="55" w:type="dxa"/>
+              <w:end w:w="75" w:type="dxa"/>
+            </w:tcMar>
+          </w:tcPr>
+          <w:p>
+            <w:pPr>
+              <w:spacing w:after="0" w:before="0"/>
+            </w:pPr>
+            <w:r>
+              <w:rPr>
+                <w:sz w:val="17"/>
+              </w:rPr>
+              <w:t>NQT</w:t>
+            </w:r>
+          </w:p>
+        </w:tc>
+        <w:tc>
+          <w:tcPr>
+            <w:tcW w:type="dxa" w:w="6912"/>
+            <w:vAlign w:val="center"/>
+            <w:tcMar>
+              <w:top w:w="55" w:type="dxa"/>
+              <w:start w:w="75" w:type="dxa"/>
+              <w:bottom w:w="55" w:type="dxa"/>
+              <w:end w:w="75" w:type="dxa"/>
+            </w:tcMar>
+          </w:tcPr>
+          <w:p>
+            <w:pPr>
+              <w:spacing w:after="0"/>
+            </w:pPr>
+            <w:r>
+              <w:t>Đã phân công dưới SCRUM-133; owner NQT.</w:t>
+            </w:r>
+          </w:p>
+        </w:tc>
+      </w:tr>
+      <w:tr>
+        <w:tc>
+          <w:tcPr>
+            <w:tcW w:type="dxa" w:w="1440"/>
+            <w:vAlign w:val="center"/>
+            <w:tcMar>
+              <w:top w:w="55" w:type="dxa"/>
+              <w:start w:w="75" w:type="dxa"/>
+              <w:bottom w:w="55" w:type="dxa"/>
+              <w:end w:w="75" w:type="dxa"/>
+            </w:tcMar>
+          </w:tcPr>
+          <w:p>
+            <w:pPr>
+              <w:spacing w:after="0" w:before="0"/>
+            </w:pPr>
+            <w:r>
+              <w:rPr>
+                <w:sz w:val="17"/>
+              </w:rPr>
+              <w:t>SCRUM-42</w:t>
+            </w:r>
+          </w:p>
+        </w:tc>
+        <w:tc>
+          <w:tcPr>
+            <w:tcW w:type="dxa" w:w="2376"/>
+            <w:vAlign w:val="center"/>
+            <w:tcMar>
+              <w:top w:w="55" w:type="dxa"/>
+              <w:start w:w="75" w:type="dxa"/>
+              <w:bottom w:w="55" w:type="dxa"/>
+              <w:end w:w="75" w:type="dxa"/>
+            </w:tcMar>
+          </w:tcPr>
+          <w:p>
+            <w:pPr>
+              <w:spacing w:after="0"/>
+            </w:pPr>
+            <w:r>
+              <w:rPr>
+                <w:sz w:val="17"/>
+              </w:rPr>
+              <w:t>S-06 — Trụ đã đăng ký kết nối được qua WebSocket, trụ lạ bị từ chối</w:t>
+            </w:r>
+          </w:p>
+        </w:tc>
+        <w:tc>
+          <w:tcPr>
+            <w:tcW w:type="dxa" w:w="3672"/>
+            <w:vAlign w:val="center"/>
+            <w:tcMar>
+              <w:top w:w="55" w:type="dxa"/>
+              <w:start w:w="75" w:type="dxa"/>
+              <w:bottom w:w="55" w:type="dxa"/>
+              <w:end w:w="75" w:type="dxa"/>
+            </w:tcMar>
+          </w:tcPr>
+          <w:p>
+            <w:pPr>
+              <w:spacing w:after="0" w:before="0"/>
+            </w:pPr>
+            <w:r>
+              <w:rPr>
+                <w:sz w:val="17"/>
+              </w:rPr>
+              <w:t>NQT</w:t>
+            </w:r>
+          </w:p>
+        </w:tc>
+        <w:tc>
+          <w:tcPr>
+            <w:tcW w:type="dxa" w:w="6912"/>
+            <w:vAlign w:val="center"/>
+            <w:tcMar>
+              <w:top w:w="55" w:type="dxa"/>
+              <w:start w:w="75" w:type="dxa"/>
+              <w:bottom w:w="55" w:type="dxa"/>
+              <w:end w:w="75" w:type="dxa"/>
+            </w:tcMar>
+          </w:tcPr>
+          <w:p>
+            <w:pPr>
+              <w:spacing w:after="0"/>
+            </w:pPr>
+            <w:r>
+              <w:rPr>
+                <w:sz w:val="17"/>
+              </w:rPr>
+              <w:t>Story đã được chia và giao qua SCRUM-108, SCRUM-109; nội dung khớp.</w:t>
+            </w:r>
+          </w:p>
+        </w:tc>
+      </w:tr>
+      <w:tr>
+        <w:tc>
+          <w:tcPr>
+            <w:tcW w:type="dxa" w:w="1440"/>
+            <w:vAlign w:val="center"/>
+            <w:tcMar>
+              <w:top w:w="55" w:type="dxa"/>
+              <w:start w:w="75" w:type="dxa"/>
+              <w:bottom w:w="55" w:type="dxa"/>
+              <w:end w:w="75" w:type="dxa"/>
+            </w:tcMar>
+          </w:tcPr>
+          <w:p>
+            <w:pPr>
+              <w:spacing w:after="0" w:before="0"/>
+            </w:pPr>
+            <w:r>
+              <w:rPr>
+                <w:sz w:val="17"/>
+              </w:rPr>
+              <w:t>SCRUM-43</w:t>
+            </w:r>
+          </w:p>
+        </w:tc>
+        <w:tc>
+          <w:tcPr>
+            <w:tcW w:type="dxa" w:w="2376"/>
+            <w:vAlign w:val="center"/>
+            <w:tcMar>
+              <w:top w:w="55" w:type="dxa"/>
+              <w:start w:w="75" w:type="dxa"/>
+              <w:bottom w:w="55" w:type="dxa"/>
+              <w:end w:w="75" w:type="dxa"/>
+            </w:tcMar>
+          </w:tcPr>
+          <w:p>
+            <w:pPr>
+              <w:spacing w:after="0"/>
+            </w:pPr>
+            <w:r>
+              <w:rPr>
+                <w:sz w:val="17"/>
+              </w:rPr>
+              <w:t>S-07 — Hệ thống đọc và ghi đúng ba loại khung tin nhắn OCPP</w:t>
+            </w:r>
+          </w:p>
+        </w:tc>
+        <w:tc>
+          <w:tcPr>
+            <w:tcW w:type="dxa" w:w="3672"/>
+            <w:vAlign w:val="center"/>
+            <w:tcMar>
+              <w:top w:w="55" w:type="dxa"/>
+              <w:start w:w="75" w:type="dxa"/>
+              <w:bottom w:w="55" w:type="dxa"/>
+              <w:end w:w="75" w:type="dxa"/>
+            </w:tcMar>
+          </w:tcPr>
+          <w:p>
+            <w:pPr>
+              <w:spacing w:after="0" w:before="0"/>
+            </w:pPr>
+            <w:r>
+              <w:rPr>
+                <w:sz w:val="17"/>
+              </w:rPr>
+              <w:t>NQT; Vinh kiểm thử</w:t>
+            </w:r>
+          </w:p>
+        </w:tc>
+        <w:tc>
+          <w:tcPr>
+            <w:tcW w:type="dxa" w:w="6912"/>
+            <w:vAlign w:val="center"/>
+            <w:tcMar>
+              <w:top w:w="55" w:type="dxa"/>
+              <w:start w:w="75" w:type="dxa"/>
+              <w:bottom w:w="55" w:type="dxa"/>
+              <w:end w:w="75" w:type="dxa"/>
+            </w:tcMar>
+          </w:tcPr>
+          <w:p>
+            <w:pPr>
+              <w:spacing w:after="0"/>
+            </w:pPr>
+            <w:r>
+              <w:rPr>
+                <w:sz w:val="17"/>
+              </w:rPr>
+              <w:t>Story đã được chia và giao qua SCRUM-110, SCRUM-111; nội dung khớp.</w:t>
+            </w:r>
+          </w:p>
+        </w:tc>
+      </w:tr>
+      <w:tr>
+        <w:tc>
+          <w:tcPr>
+            <w:tcW w:type="dxa" w:w="1440"/>
+            <w:vAlign w:val="center"/>
+            <w:tcMar>
+              <w:top w:w="55" w:type="dxa"/>
+              <w:start w:w="75" w:type="dxa"/>
+              <w:bottom w:w="55" w:type="dxa"/>
+              <w:end w:w="75" w:type="dxa"/>
+            </w:tcMar>
+          </w:tcPr>
+          <w:p>
+            <w:pPr>
+              <w:spacing w:after="0" w:before="0"/>
+            </w:pPr>
+            <w:r>
+              <w:rPr>
+                <w:sz w:val="17"/>
+              </w:rPr>
+              <w:t>SCRUM-44</w:t>
+            </w:r>
+          </w:p>
+        </w:tc>
+        <w:tc>
+          <w:tcPr>
+            <w:tcW w:type="dxa" w:w="2376"/>
+            <w:vAlign w:val="center"/>
+            <w:tcMar>
+              <w:top w:w="55" w:type="dxa"/>
+              <w:start w:w="75" w:type="dxa"/>
+              <w:bottom w:w="55" w:type="dxa"/>
+              <w:end w:w="75" w:type="dxa"/>
+            </w:tcMar>
+          </w:tcPr>
+          <w:p>
+            <w:pPr>
+              <w:spacing w:after="0"/>
+            </w:pPr>
+            <w:r>
+              <w:rPr>
+                <w:sz w:val="17"/>
+              </w:rPr>
+              <w:t>S-08 — Trụ khởi động được chấp nhận qua BootNotification</w:t>
+            </w:r>
+          </w:p>
+        </w:tc>
+        <w:tc>
+          <w:tcPr>
+            <w:tcW w:type="dxa" w:w="3672"/>
+            <w:vAlign w:val="center"/>
+            <w:tcMar>
+              <w:top w:w="55" w:type="dxa"/>
+              <w:start w:w="75" w:type="dxa"/>
+              <w:bottom w:w="55" w:type="dxa"/>
+              <w:end w:w="75" w:type="dxa"/>
+            </w:tcMar>
+          </w:tcPr>
+          <w:p>
+            <w:pPr>
+              <w:spacing w:after="0" w:before="0"/>
+            </w:pPr>
+            <w:r>
+              <w:rPr>
+                <w:sz w:val="17"/>
+              </w:rPr>
+              <w:t>NLT</w:t>
+            </w:r>
+          </w:p>
+        </w:tc>
+        <w:tc>
+          <w:tcPr>
+            <w:tcW w:type="dxa" w:w="6912"/>
+            <w:vAlign w:val="center"/>
+            <w:tcMar>
+              <w:top w:w="55" w:type="dxa"/>
+              <w:start w:w="75" w:type="dxa"/>
+              <w:bottom w:w="55" w:type="dxa"/>
+              <w:end w:w="75" w:type="dxa"/>
+            </w:tcMar>
+          </w:tcPr>
+          <w:p>
+            <w:pPr>
+              <w:spacing w:after="0"/>
+            </w:pPr>
+            <w:r>
+              <w:rPr>
+                <w:sz w:val="17"/>
+              </w:rPr>
+              <w:t>Story đã được chia và giao qua SCRUM-112, SCRUM-113; nội dung khớp.</w:t>
+            </w:r>
+          </w:p>
+        </w:tc>
+      </w:tr>
+      <w:tr>
+        <w:tc>
+          <w:tcPr>
+            <w:tcW w:type="dxa" w:w="1440"/>
+            <w:vAlign w:val="center"/>
+            <w:tcMar>
+              <w:top w:w="55" w:type="dxa"/>
+              <w:start w:w="75" w:type="dxa"/>
+              <w:bottom w:w="55" w:type="dxa"/>
+              <w:end w:w="75" w:type="dxa"/>
+            </w:tcMar>
+          </w:tcPr>
+          <w:p>
+            <w:pPr>
+              <w:spacing w:after="0" w:before="0"/>
+            </w:pPr>
+            <w:r>
+              <w:rPr>
+                <w:sz w:val="17"/>
+              </w:rPr>
+              <w:t>SCRUM-45</w:t>
+            </w:r>
+          </w:p>
+        </w:tc>
+        <w:tc>
+          <w:tcPr>
+            <w:tcW w:type="dxa" w:w="2376"/>
+            <w:vAlign w:val="center"/>
+            <w:tcMar>
+              <w:top w:w="55" w:type="dxa"/>
+              <w:start w:w="75" w:type="dxa"/>
+              <w:bottom w:w="55" w:type="dxa"/>
+              <w:end w:w="75" w:type="dxa"/>
+            </w:tcMar>
+          </w:tcPr>
+          <w:p>
+            <w:pPr>
+              <w:spacing w:after="0"/>
+            </w:pPr>
+            <w:r>
+              <w:rPr>
+                <w:sz w:val="17"/>
+              </w:rPr>
+              <w:t>S-09 — Trụ báo nhịp tim và thời điểm liên lạc cuối được cập nhật</w:t>
+            </w:r>
+          </w:p>
+        </w:tc>
+        <w:tc>
+          <w:tcPr>
+            <w:tcW w:type="dxa" w:w="3672"/>
+            <w:vAlign w:val="center"/>
+            <w:tcMar>
+              <w:top w:w="55" w:type="dxa"/>
+              <w:start w:w="75" w:type="dxa"/>
+              <w:bottom w:w="55" w:type="dxa"/>
+              <w:end w:w="75" w:type="dxa"/>
+            </w:tcMar>
+          </w:tcPr>
+          <w:p>
+            <w:pPr>
+              <w:spacing w:after="0" w:before="0"/>
+            </w:pPr>
+            <w:r>
+              <w:rPr>
+                <w:sz w:val="17"/>
+              </w:rPr>
+              <w:t>NLT; Vinh kiểm thử</w:t>
+            </w:r>
+          </w:p>
+        </w:tc>
+        <w:tc>
+          <w:tcPr>
+            <w:tcW w:type="dxa" w:w="6912"/>
+            <w:vAlign w:val="center"/>
+            <w:tcMar>
+              <w:top w:w="55" w:type="dxa"/>
+              <w:start w:w="75" w:type="dxa"/>
+              <w:bottom w:w="55" w:type="dxa"/>
+              <w:end w:w="75" w:type="dxa"/>
+            </w:tcMar>
+          </w:tcPr>
+          <w:p>
+            <w:pPr>
+              <w:spacing w:after="0"/>
+            </w:pPr>
+            <w:r>
+              <w:rPr>
+                <w:sz w:val="17"/>
+              </w:rPr>
+              <w:t>Story đã được chia và giao qua SCRUM-117, SCRUM-118; nội dung khớp.</w:t>
+            </w:r>
+          </w:p>
+        </w:tc>
+      </w:tr>
+      <w:tr>
+        <w:tc>
+          <w:tcPr>
+            <w:tcW w:type="dxa" w:w="1440"/>
+            <w:vAlign w:val="center"/>
+            <w:tcMar>
+              <w:top w:w="55" w:type="dxa"/>
+              <w:start w:w="75" w:type="dxa"/>
+              <w:bottom w:w="55" w:type="dxa"/>
+              <w:end w:w="75" w:type="dxa"/>
+            </w:tcMar>
+          </w:tcPr>
+          <w:p>
+            <w:pPr>
+              <w:spacing w:after="0" w:before="0"/>
+            </w:pPr>
+            <w:r>
+              <w:rPr>
+                <w:sz w:val="17"/>
+              </w:rPr>
+              <w:t>SCRUM-46</w:t>
+            </w:r>
+          </w:p>
+        </w:tc>
+        <w:tc>
+          <w:tcPr>
+            <w:tcW w:type="dxa" w:w="2376"/>
+            <w:vAlign w:val="center"/>
+            <w:tcMar>
+              <w:top w:w="55" w:type="dxa"/>
+              <w:start w:w="75" w:type="dxa"/>
+              <w:bottom w:w="55" w:type="dxa"/>
+              <w:end w:w="75" w:type="dxa"/>
+            </w:tcMar>
+          </w:tcPr>
+          <w:p>
+            <w:pPr>
+              <w:spacing w:after="0"/>
+            </w:pPr>
+            <w:r>
+              <w:rPr>
+                <w:sz w:val="17"/>
+              </w:rPr>
+              <w:t>S-10 — Trụ báo trạng thái từng đầu nối qua StatusNotification</w:t>
+            </w:r>
+          </w:p>
+        </w:tc>
+        <w:tc>
+          <w:tcPr>
+            <w:tcW w:type="dxa" w:w="3672"/>
+            <w:vAlign w:val="center"/>
+            <w:tcMar>
+              <w:top w:w="55" w:type="dxa"/>
+              <w:start w:w="75" w:type="dxa"/>
+              <w:bottom w:w="55" w:type="dxa"/>
+              <w:end w:w="75" w:type="dxa"/>
+            </w:tcMar>
+          </w:tcPr>
+          <w:p>
+            <w:pPr>
+              <w:spacing w:after="0" w:before="0"/>
+            </w:pPr>
+            <w:r>
+              <w:rPr>
+                <w:sz w:val="17"/>
+              </w:rPr>
+              <w:t>NLT</w:t>
+            </w:r>
+          </w:p>
+        </w:tc>
+        <w:tc>
+          <w:tcPr>
+            <w:tcW w:type="dxa" w:w="6912"/>
+            <w:vAlign w:val="center"/>
+            <w:tcMar>
+              <w:top w:w="55" w:type="dxa"/>
+              <w:start w:w="75" w:type="dxa"/>
+              <w:bottom w:w="55" w:type="dxa"/>
+              <w:end w:w="75" w:type="dxa"/>
+            </w:tcMar>
+          </w:tcPr>
+          <w:p>
+            <w:pPr>
+              <w:spacing w:after="0"/>
+            </w:pPr>
+            <w:r>
+              <w:rPr>
+                <w:sz w:val="17"/>
+              </w:rPr>
+              <w:t>Story đã được chia và giao qua SCRUM-119, SCRUM-120, SCRUM-121; nội dung khớp.</w:t>
+            </w:r>
+          </w:p>
+        </w:tc>
+      </w:tr>
+      <w:tr>
+        <w:tc>
+          <w:tcPr>
+            <w:tcW w:type="dxa" w:w="1440"/>
+            <w:vAlign w:val="center"/>
+            <w:tcMar>
+              <w:top w:w="55" w:type="dxa"/>
+              <w:start w:w="75" w:type="dxa"/>
+              <w:bottom w:w="55" w:type="dxa"/>
+              <w:end w:w="75" w:type="dxa"/>
+            </w:tcMar>
+          </w:tcPr>
+          <w:p>
+            <w:pPr>
+              <w:spacing w:after="0" w:before="0"/>
+            </w:pPr>
+            <w:r>
+              <w:rPr>
+                <w:sz w:val="17"/>
+              </w:rPr>
+              <w:t>SCRUM-47</w:t>
+            </w:r>
+          </w:p>
+        </w:tc>
+        <w:tc>
+          <w:tcPr>
+            <w:tcW w:type="dxa" w:w="2376"/>
+            <w:vAlign w:val="center"/>
+            <w:tcMar>
+              <w:top w:w="55" w:type="dxa"/>
+              <w:start w:w="75" w:type="dxa"/>
+              <w:bottom w:w="55" w:type="dxa"/>
+              <w:end w:w="75" w:type="dxa"/>
+            </w:tcMar>
+          </w:tcPr>
+          <w:p>
+            <w:pPr>
+              <w:spacing w:after="0"/>
+            </w:pPr>
+            <w:r>
+              <w:rPr>
+                <w:sz w:val="17"/>
+              </w:rPr>
+              <w:t>S-11 — Vận hành viên xem trạng thái mọi trụ trên một màn hình tự cập nhật</w:t>
+            </w:r>
+          </w:p>
+        </w:tc>
+        <w:tc>
+          <w:tcPr>
+            <w:tcW w:type="dxa" w:w="3672"/>
+            <w:vAlign w:val="center"/>
+            <w:tcMar>
+              <w:top w:w="55" w:type="dxa"/>
+              <w:start w:w="75" w:type="dxa"/>
+              <w:bottom w:w="55" w:type="dxa"/>
+              <w:end w:w="75" w:type="dxa"/>
+            </w:tcMar>
+          </w:tcPr>
+          <w:p>
+            <w:pPr>
+              <w:spacing w:after="0" w:before="0"/>
+            </w:pPr>
+            <w:r>
+              <w:rPr>
+                <w:sz w:val="17"/>
+              </w:rPr>
+              <w:t>Tân (truy vấn), NQT (realtime), Tuấn (UI); Tú hỗ trợ hook</w:t>
+            </w:r>
+          </w:p>
+        </w:tc>
+        <w:tc>
+          <w:tcPr>
+            <w:tcW w:type="dxa" w:w="6912"/>
+            <w:vAlign w:val="center"/>
+            <w:tcMar>
+              <w:top w:w="55" w:type="dxa"/>
+              <w:start w:w="75" w:type="dxa"/>
+              <w:bottom w:w="55" w:type="dxa"/>
+              <w:end w:w="75" w:type="dxa"/>
+            </w:tcMar>
+          </w:tcPr>
+          <w:p>
+            <w:pPr>
+              <w:spacing w:after="0"/>
+            </w:pPr>
+            <w:r>
+              <w:rPr>
+                <w:sz w:val="17"/>
+              </w:rPr>
+              <w:t>Story đã được chia và giao qua SCRUM-122, SCRUM-123, SCRUM-124; nội dung khớp.</w:t>
+            </w:r>
+          </w:p>
+        </w:tc>
+      </w:tr>
+      <w:tr>
+        <w:tc>
+          <w:tcPr>
+            <w:tcW w:type="dxa" w:w="1440"/>
+            <w:vAlign w:val="center"/>
+            <w:tcMar>
+              <w:top w:w="55" w:type="dxa"/>
+              <w:start w:w="75" w:type="dxa"/>
+              <w:bottom w:w="55" w:type="dxa"/>
+              <w:end w:w="75" w:type="dxa"/>
+            </w:tcMar>
+          </w:tcPr>
+          <w:p>
+            <w:pPr>
+              <w:spacing w:after="0" w:before="0"/>
+            </w:pPr>
+            <w:r>
+              <w:rPr>
+                <w:sz w:val="17"/>
+              </w:rPr>
+              <w:t>SCRUM-48</w:t>
+            </w:r>
+          </w:p>
+        </w:tc>
+        <w:tc>
+          <w:tcPr>
+            <w:tcW w:type="dxa" w:w="2376"/>
+            <w:vAlign w:val="center"/>
+            <w:tcMar>
+              <w:top w:w="55" w:type="dxa"/>
+              <w:start w:w="75" w:type="dxa"/>
+              <w:bottom w:w="55" w:type="dxa"/>
+              <w:end w:w="75" w:type="dxa"/>
+            </w:tcMar>
+          </w:tcPr>
+          <w:p>
+            <w:pPr>
+              <w:spacing w:after="0"/>
+            </w:pPr>
+            <w:r>
+              <w:rPr>
+                <w:sz w:val="17"/>
+              </w:rPr>
+              <w:t>S-12 — Trụ quá hạn nhịp tim bị đánh dấu ngoại tuyến</w:t>
+            </w:r>
+          </w:p>
+        </w:tc>
+        <w:tc>
+          <w:tcPr>
+            <w:tcW w:type="dxa" w:w="3672"/>
+            <w:vAlign w:val="center"/>
+            <w:tcMar>
+              <w:top w:w="55" w:type="dxa"/>
+              <w:start w:w="75" w:type="dxa"/>
+              <w:bottom w:w="55" w:type="dxa"/>
+              <w:end w:w="75" w:type="dxa"/>
+            </w:tcMar>
+          </w:tcPr>
+          <w:p>
+            <w:pPr>
+              <w:spacing w:after="0" w:before="0"/>
+            </w:pPr>
+            <w:r>
+              <w:rPr>
+                <w:sz w:val="17"/>
+              </w:rPr>
+              <w:t>Tân; Đức kiểm thử</w:t>
+            </w:r>
+          </w:p>
+        </w:tc>
+        <w:tc>
+          <w:tcPr>
+            <w:tcW w:type="dxa" w:w="6912"/>
+            <w:vAlign w:val="center"/>
+            <w:tcMar>
+              <w:top w:w="55" w:type="dxa"/>
+              <w:start w:w="75" w:type="dxa"/>
+              <w:bottom w:w="55" w:type="dxa"/>
+              <w:end w:w="75" w:type="dxa"/>
+            </w:tcMar>
+          </w:tcPr>
+          <w:p>
+            <w:pPr>
+              <w:spacing w:after="0"/>
+            </w:pPr>
+            <w:r>
+              <w:rPr>
+                <w:sz w:val="17"/>
+              </w:rPr>
+              <w:t>Story đã được chia và giao qua SCRUM-125, SCRUM-126; nội dung khớp.</w:t>
+            </w:r>
+          </w:p>
+        </w:tc>
+      </w:tr>
+      <w:tr>
+        <w:tc>
+          <w:tcPr>
+            <w:tcW w:type="dxa" w:w="1440"/>
+            <w:vAlign w:val="center"/>
+            <w:tcMar>
+              <w:top w:w="55" w:type="dxa"/>
+              <w:start w:w="75" w:type="dxa"/>
+              <w:bottom w:w="55" w:type="dxa"/>
+              <w:end w:w="75" w:type="dxa"/>
+            </w:tcMar>
+          </w:tcPr>
+          <w:p>
+            <w:pPr>
+              <w:spacing w:after="0" w:before="0"/>
+            </w:pPr>
+            <w:r>
+              <w:rPr>
+                <w:sz w:val="17"/>
+              </w:rPr>
+              <w:t>SCRUM-49</w:t>
+            </w:r>
+          </w:p>
+        </w:tc>
+        <w:tc>
+          <w:tcPr>
+            <w:tcW w:type="dxa" w:w="2376"/>
+            <w:vAlign w:val="center"/>
+            <w:tcMar>
+              <w:top w:w="55" w:type="dxa"/>
+              <w:start w:w="75" w:type="dxa"/>
+              <w:bottom w:w="55" w:type="dxa"/>
+              <w:end w:w="75" w:type="dxa"/>
+            </w:tcMar>
+          </w:tcPr>
+          <w:p>
+            <w:pPr>
+              <w:spacing w:after="0"/>
+            </w:pPr>
+            <w:r>
+              <w:rPr>
+                <w:sz w:val="17"/>
+              </w:rPr>
+              <w:t>S-13 — Cùng mã trụ mở hai kết nối thì kết nối cũ bị đóng</w:t>
+            </w:r>
+          </w:p>
+        </w:tc>
+        <w:tc>
+          <w:tcPr>
+            <w:tcW w:type="dxa" w:w="3672"/>
+            <w:vAlign w:val="center"/>
+            <w:tcMar>
+              <w:top w:w="55" w:type="dxa"/>
+              <w:start w:w="75" w:type="dxa"/>
+              <w:bottom w:w="55" w:type="dxa"/>
+              <w:end w:w="75" w:type="dxa"/>
+            </w:tcMar>
+          </w:tcPr>
+          <w:p>
+            <w:pPr>
+              <w:spacing w:after="0" w:before="0"/>
+            </w:pPr>
+            <w:r>
+              <w:rPr>
+                <w:sz w:val="17"/>
+              </w:rPr>
+              <w:t>NQT; Vinh kiểm thử</w:t>
+            </w:r>
+          </w:p>
+        </w:tc>
+        <w:tc>
+          <w:tcPr>
+            <w:tcW w:type="dxa" w:w="6912"/>
+            <w:vAlign w:val="center"/>
+            <w:tcMar>
+              <w:top w:w="55" w:type="dxa"/>
+              <w:start w:w="75" w:type="dxa"/>
+              <w:bottom w:w="55" w:type="dxa"/>
+              <w:end w:w="75" w:type="dxa"/>
+            </w:tcMar>
+          </w:tcPr>
+          <w:p>
+            <w:pPr>
+              <w:spacing w:after="0"/>
+            </w:pPr>
+            <w:r>
+              <w:rPr>
+                <w:sz w:val="17"/>
+              </w:rPr>
+              <w:t>Story đã được chia và giao qua SCRUM-127, SCRUM-128; nội dung khớp.</w:t>
+            </w:r>
+          </w:p>
+        </w:tc>
+      </w:tr>
+      <w:tr>
+        <w:tc>
+          <w:tcPr>
+            <w:tcW w:type="dxa" w:w="1440"/>
+            <w:vAlign w:val="center"/>
+            <w:tcMar>
+              <w:top w:w="55" w:type="dxa"/>
+              <w:start w:w="75" w:type="dxa"/>
+              <w:bottom w:w="55" w:type="dxa"/>
+              <w:end w:w="75" w:type="dxa"/>
+            </w:tcMar>
+          </w:tcPr>
+          <w:p>
+            <w:pPr>
+              <w:spacing w:after="0" w:before="0"/>
+            </w:pPr>
+            <w:r>
+              <w:rPr>
+                <w:sz w:val="17"/>
+              </w:rPr>
+              <w:t>SCRUM-50</w:t>
+            </w:r>
+          </w:p>
+        </w:tc>
+        <w:tc>
+          <w:tcPr>
+            <w:tcW w:type="dxa" w:w="2376"/>
+            <w:vAlign w:val="center"/>
+            <w:tcMar>
+              <w:top w:w="55" w:type="dxa"/>
+              <w:start w:w="75" w:type="dxa"/>
+              <w:bottom w:w="55" w:type="dxa"/>
+              <w:end w:w="75" w:type="dxa"/>
+            </w:tcMar>
+          </w:tcPr>
+          <w:p>
+            <w:pPr>
+              <w:spacing w:after="0"/>
+            </w:pPr>
+            <w:r>
+              <w:rPr>
+                <w:sz w:val="17"/>
+              </w:rPr>
+              <w:t>S-14 — Tin nhắn trùng mã nhận lại đúng câu trả lời cũ, không xử lý hai lần</w:t>
+            </w:r>
+          </w:p>
+        </w:tc>
+        <w:tc>
+          <w:tcPr>
+            <w:tcW w:type="dxa" w:w="3672"/>
+            <w:vAlign w:val="center"/>
+            <w:tcMar>
+              <w:top w:w="55" w:type="dxa"/>
+              <w:start w:w="75" w:type="dxa"/>
+              <w:bottom w:w="55" w:type="dxa"/>
+              <w:end w:w="75" w:type="dxa"/>
+            </w:tcMar>
+          </w:tcPr>
+          <w:p>
+            <w:pPr>
+              <w:spacing w:after="0" w:before="0"/>
+            </w:pPr>
+            <w:r>
+              <w:rPr>
+                <w:sz w:val="17"/>
+              </w:rPr>
+              <w:t>Tân (job); Đức (test)</w:t>
+            </w:r>
+          </w:p>
+        </w:tc>
+        <w:tc>
+          <w:tcPr>
+            <w:tcW w:type="dxa" w:w="6912"/>
+            <w:vAlign w:val="center"/>
+            <w:tcMar>
+              <w:top w:w="55" w:type="dxa"/>
+              <w:start w:w="75" w:type="dxa"/>
+              <w:bottom w:w="55" w:type="dxa"/>
+              <w:end w:w="75" w:type="dxa"/>
+            </w:tcMar>
+          </w:tcPr>
+          <w:p>
+            <w:pPr>
+              <w:spacing w:after="0"/>
+            </w:pPr>
+            <w:r>
+              <w:rPr>
+                <w:sz w:val="17"/>
+              </w:rPr>
+              <w:t>Story đã được chia và giao qua SCRUM-129, SCRUM-130; nội dung khớp.</w:t>
+            </w:r>
+          </w:p>
+        </w:tc>
+      </w:tr>
+      <w:tr>
+        <w:tc>
+          <w:tcPr>
+            <w:tcW w:type="dxa" w:w="1440"/>
+            <w:vAlign w:val="center"/>
+            <w:tcMar>
+              <w:top w:w="55" w:type="dxa"/>
+              <w:start w:w="75" w:type="dxa"/>
+              <w:bottom w:w="55" w:type="dxa"/>
+              <w:end w:w="75" w:type="dxa"/>
+            </w:tcMar>
+          </w:tcPr>
+          <w:p>
+            <w:pPr>
+              <w:spacing w:after="0" w:before="0"/>
+            </w:pPr>
+            <w:r>
+              <w:rPr>
+                <w:sz w:val="17"/>
+              </w:rPr>
+              <w:t>SCRUM-51</w:t>
+            </w:r>
+          </w:p>
+        </w:tc>
+        <w:tc>
+          <w:tcPr>
+            <w:tcW w:type="dxa" w:w="2376"/>
+            <w:vAlign w:val="center"/>
+            <w:tcMar>
+              <w:top w:w="55" w:type="dxa"/>
+              <w:start w:w="75" w:type="dxa"/>
+              <w:bottom w:w="55" w:type="dxa"/>
+              <w:end w:w="75" w:type="dxa"/>
+            </w:tcMar>
+          </w:tcPr>
+          <w:p>
+            <w:pPr>
+              <w:spacing w:after="0"/>
+            </w:pPr>
+            <w:r>
+              <w:rPr>
+                <w:sz w:val="17"/>
+              </w:rPr>
+              <w:t>S-15 — Trụ xác thực thẻ tài xế qua Authorize</w:t>
+            </w:r>
+          </w:p>
+        </w:tc>
+        <w:tc>
+          <w:tcPr>
+            <w:tcW w:type="dxa" w:w="3672"/>
+            <w:vAlign w:val="center"/>
+            <w:tcMar>
+              <w:top w:w="55" w:type="dxa"/>
+              <w:start w:w="75" w:type="dxa"/>
+              <w:bottom w:w="55" w:type="dxa"/>
+              <w:end w:w="75" w:type="dxa"/>
+            </w:tcMar>
+          </w:tcPr>
+          <w:p>
+            <w:pPr>
+              <w:spacing w:after="0" w:before="0"/>
+            </w:pPr>
+            <w:r>
+              <w:rPr>
+                <w:sz w:val="17"/>
+              </w:rPr>
+              <w:t>Tân (bảng); NLT (handler)</w:t>
+            </w:r>
+          </w:p>
+        </w:tc>
+        <w:tc>
+          <w:tcPr>
+            <w:tcW w:type="dxa" w:w="6912"/>
+            <w:vAlign w:val="center"/>
+            <w:tcMar>
+              <w:top w:w="55" w:type="dxa"/>
+              <w:start w:w="75" w:type="dxa"/>
+              <w:bottom w:w="55" w:type="dxa"/>
+              <w:end w:w="75" w:type="dxa"/>
+            </w:tcMar>
+          </w:tcPr>
+          <w:p>
+            <w:pPr>
+              <w:spacing w:after="0"/>
+            </w:pPr>
+            <w:r>
+              <w:rPr>
+                <w:sz w:val="17"/>
+              </w:rPr>
+              <w:t>Story đã được chia và giao qua SCRUM-131, SCRUM-132; nội dung khớp.</w:t>
+            </w:r>
+          </w:p>
+        </w:tc>
+      </w:tr>
+      <w:tr>
+        <w:tc>
+          <w:tcPr>
+            <w:tcW w:type="dxa" w:w="1440"/>
+            <w:vAlign w:val="center"/>
+            <w:tcMar>
+              <w:top w:w="55" w:type="dxa"/>
+              <w:start w:w="75" w:type="dxa"/>
+              <w:bottom w:w="55" w:type="dxa"/>
+              <w:end w:w="75" w:type="dxa"/>
+            </w:tcMar>
+          </w:tcPr>
+          <w:p>
+            <w:pPr>
+              <w:spacing w:after="0" w:before="0"/>
+            </w:pPr>
+            <w:r>
+              <w:rPr>
+                <w:sz w:val="17"/>
+              </w:rPr>
+              <w:t>SCRUM-52</w:t>
+            </w:r>
+          </w:p>
+        </w:tc>
+        <w:tc>
+          <w:tcPr>
+            <w:tcW w:type="dxa" w:w="2376"/>
+            <w:vAlign w:val="center"/>
+            <w:tcMar>
+              <w:top w:w="55" w:type="dxa"/>
+              <w:start w:w="75" w:type="dxa"/>
+              <w:bottom w:w="55" w:type="dxa"/>
+              <w:end w:w="75" w:type="dxa"/>
+            </w:tcMar>
+          </w:tcPr>
+          <w:p>
+            <w:pPr>
+              <w:spacing w:after="0"/>
+            </w:pPr>
+            <w:r>
+              <w:rPr>
+                <w:sz w:val="17"/>
+              </w:rPr>
+              <w:t>S-16 — Vận hành viên khởi động lại trụ từ xa bằng Reset</w:t>
+            </w:r>
+          </w:p>
+        </w:tc>
+        <w:tc>
+          <w:tcPr>
+            <w:tcW w:type="dxa" w:w="3672"/>
+            <w:vAlign w:val="center"/>
+            <w:tcMar>
+              <w:top w:w="55" w:type="dxa"/>
+              <w:start w:w="75" w:type="dxa"/>
+              <w:bottom w:w="55" w:type="dxa"/>
+              <w:end w:w="75" w:type="dxa"/>
+            </w:tcMar>
+          </w:tcPr>
+          <w:p>
+            <w:pPr>
+              <w:spacing w:after="0" w:before="0"/>
+            </w:pPr>
+            <w:r>
+              <w:rPr>
+                <w:sz w:val="17"/>
+              </w:rPr>
+              <w:t>NQT (API); Tú (nút/UI)</w:t>
+            </w:r>
+          </w:p>
+        </w:tc>
+        <w:tc>
+          <w:tcPr>
+            <w:tcW w:type="dxa" w:w="6912"/>
+            <w:vAlign w:val="center"/>
+            <w:tcMar>
+              <w:top w:w="55" w:type="dxa"/>
+              <w:start w:w="75" w:type="dxa"/>
+              <w:bottom w:w="55" w:type="dxa"/>
+              <w:end w:w="75" w:type="dxa"/>
+            </w:tcMar>
+          </w:tcPr>
+          <w:p>
+            <w:pPr>
+              <w:spacing w:after="0"/>
+            </w:pPr>
+            <w:r>
+              <w:rPr>
+                <w:sz w:val="17"/>
+              </w:rPr>
+              <w:t>Story đã được chia và giao qua SCRUM-133 và phần giao diện SCRUM-134; nội dung khớp.</w:t>
+            </w:r>
+          </w:p>
+        </w:tc>
+      </w:tr>
+    </w:tbl>
     <w:sectPr>
-      <w:pgSz w:w="16838" w:h="11906" w:orient="landscape"/>
-      <w:pgMar w:top="720" w:right="720" w:bottom="720" w:left="720" w:header="708" w:footer="708" w:gutter="0"/>
+      <w:pgSz w:w="16834" w:h="11909" w:orient="landscape"/>
+      <w:pgMar w:top="792" w:right="792" w:bottom="792" w:left="792" w:header="708" w:footer="708" w:gutter="0"/>
       <w:pgNumType/>
       <w:docGrid w:linePitch="360"/>
     </w:sectPr>

</xml_diff>